<commit_message>
Refresh resume with impact-driven narrative; add source-parsed ATS DOCX and summary-line PDF generators
</commit_message>
<xml_diff>
--- a/Micah-Willins-ATS.docx
+++ b/Micah-Willins-ATS.docx
@@ -4,34 +4,19 @@
   <w:body>
     <w:p>
       <w:pPr>
-        <w:spacing w:after="120"/>
-      </w:pPr>
-      <w:hyperlink r:id="rId9">
-        <w:r>
-          <w:rPr>
-            <w:color w:val="0563C1"/>
-            <w:u/>
-          </w:rPr>
-          <w:t>View the live version of this resume on GitHub Pages</w:t>
-        </w:r>
-      </w:hyperlink>
-    </w:p>
-    <w:p>
-      <w:pPr>
-        <w:spacing w:after="120"/>
         <w:jc w:val="center"/>
       </w:pPr>
       <w:r>
         <w:rPr>
           <w:b/>
+          <w:color w:val="1F4B99"/>
           <w:sz w:val="36"/>
         </w:rPr>
-        <w:t>Micah Willins</w:t>
+        <w:t>MICAH WILLINS</w:t>
       </w:r>
     </w:p>
     <w:p>
       <w:pPr>
-        <w:spacing w:after="120"/>
         <w:jc w:val="center"/>
       </w:pPr>
       <w:r>
@@ -39,670 +24,743 @@
           <w:b/>
           <w:sz w:val="22"/>
         </w:rPr>
-        <w:t>Senior Data Engineer / Data and Visualization Leader</w:t>
+        <w:t>Senior Data Engineer / Data &amp; Visualization Leader</w:t>
       </w:r>
     </w:p>
     <w:p>
       <w:pPr>
-        <w:spacing w:after="200"/>
         <w:jc w:val="center"/>
       </w:pPr>
       <w:r>
         <w:rPr>
-          <w:b w:val="0"/>
+          <w:sz w:val="20"/>
         </w:rPr>
-        <w:t xml:space="preserve"> </w:t>
+        <w:t xml:space="preserve">(513) 313-4820 | Micah.Willins.88@gmail.com | Cincinnati, OH  |  </w:t>
       </w:r>
+      <w:hyperlink r:id="rId9">
+        <w:r>
+          <w:rPr>
+            <w:color w:val="0563C1"/>
+            <w:u/>
+          </w:rPr>
+          <w:t>LinkedIn</w:t>
+        </w:r>
+      </w:hyperlink>
+      <w:r>
+        <w:t xml:space="preserve">  |  </w:t>
+      </w:r>
+      <w:hyperlink r:id="rId10">
+        <w:r>
+          <w:rPr>
+            <w:color w:val="0563C1"/>
+            <w:u/>
+          </w:rPr>
+          <w:t>View Full Details &amp; References</w:t>
+        </w:r>
+      </w:hyperlink>
+    </w:p>
+    <w:p>
+      <w:pPr>
+        <w:spacing w:before="200" w:after="80"/>
+      </w:pPr>
       <w:r>
         <w:rPr>
-          <w:b w:val="0"/>
+          <w:b/>
+          <w:color w:val="1F4B99"/>
+          <w:sz w:val="24"/>
         </w:rPr>
-        <w:t>(513) 313-4820</w:t>
-      </w:r>
-      <w:r>
-        <w:rPr>
-          <w:b w:val="0"/>
-        </w:rPr>
-        <w:t xml:space="preserve"> </w:t>
-      </w:r>
-      <w:r>
-        <w:rPr>
-          <w:b w:val="0"/>
-        </w:rPr>
-        <w:t>|</w:t>
-      </w:r>
-      <w:r>
-        <w:rPr>
-          <w:b w:val="0"/>
-        </w:rPr>
-        <w:t xml:space="preserve"> </w:t>
-      </w:r>
-      <w:r>
-        <w:rPr>
-          <w:b w:val="0"/>
-        </w:rPr>
-        <w:t>Micah.Willins.88@gmail.com</w:t>
-      </w:r>
-      <w:r>
-        <w:rPr>
-          <w:b w:val="0"/>
-        </w:rPr>
-        <w:t xml:space="preserve"> </w:t>
-      </w:r>
-      <w:r>
-        <w:rPr>
-          <w:b w:val="0"/>
-        </w:rPr>
-        <w:t>|</w:t>
-      </w:r>
-      <w:r>
-        <w:rPr>
-          <w:b w:val="0"/>
-        </w:rPr>
-        <w:t xml:space="preserve"> </w:t>
-      </w:r>
-      <w:r>
-        <w:rPr>
-          <w:b w:val="0"/>
-        </w:rPr>
-        <w:t>Cincinnati, OH</w:t>
-      </w:r>
-      <w:r>
-        <w:rPr>
-          <w:b w:val="0"/>
-        </w:rPr>
-        <w:t xml:space="preserve"> </w:t>
+        <w:t>CAREER SUMMARY</w:t>
       </w:r>
     </w:p>
     <w:p>
       <w:pPr>
-        <w:pStyle w:val="Heading1"/>
-        <w:keepNext/>
-        <w:keepLines/>
-        <w:spacing w:before="160" w:after="80"/>
-        <w:ind w:left="0"/>
+        <w:spacing w:after="60"/>
       </w:pPr>
       <w:r>
-        <w:t>Summary</w:t>
+        <w:t>Data and analytics leader with 14+ years of experience translating technical infrastructure into strategic business advantage. Proven track record of modernizing data platforms and reporting systems that accelerate decision-making, reduce operational risk, and improve organizational alignment. Expertise in designing governance frameworks and trusted analytics that enable leadership to act on complex data with confidence. Bridges the gap between technical execution and business outcomes—consistently identifying where infrastructure investments yield measurable returns in efficiency, compliance, and strategic clarity.</w:t>
       </w:r>
     </w:p>
     <w:p>
       <w:pPr>
-        <w:spacing w:after="80"/>
+        <w:spacing w:before="200" w:after="80"/>
       </w:pPr>
       <w:r>
         <w:rPr>
-          <w:b w:val="0"/>
+          <w:b/>
+          <w:color w:val="1F4B99"/>
+          <w:sz w:val="24"/>
         </w:rPr>
-        <w:t>Senior data engineer and analytics leader with 14+ years of experience building scalable data platforms, modernizing reporting workflows, and translating operational and regulatory requirements into actionable insight. Experienced in designing trusted data pipelines, improving governance, delivering executive-ready visual analytics, and aligning technical work with business priorities.</w:t>
+        <w:t>STRATEGIC FOCUS</w:t>
       </w:r>
     </w:p>
     <w:p>
       <w:pPr>
-        <w:pStyle w:val="Heading1"/>
-        <w:keepNext/>
-        <w:keepLines/>
-        <w:spacing w:before="160" w:after="80"/>
-        <w:ind w:left="0"/>
-      </w:pPr>
-      <w:r>
-        <w:t>Core Skills</w:t>
-      </w:r>
-    </w:p>
-    <w:p>
-      <w:pPr>
-        <w:spacing w:after="80"/>
+        <w:spacing w:after="60"/>
       </w:pPr>
       <w:r>
         <w:rPr>
           <w:b/>
         </w:rPr>
-        <w:t>Data Architecture:</w:t>
+        <w:t>Business Outcomes:</w:t>
       </w:r>
       <w:r>
-        <w:rPr>
-          <w:b w:val="0"/>
-        </w:rPr>
-        <w:t xml:space="preserve"> ETL, API Integration, Data Modeling, Workflow Automation, Data Quality, Data Governance</w:t>
+        <w:t>Executive Decision Clarity | Risk &amp; Compliance Acceleration | Operational Efficiency | Trust-Based Analytics</w:t>
       </w:r>
     </w:p>
     <w:p>
       <w:pPr>
-        <w:spacing w:after="80"/>
+        <w:spacing w:after="60"/>
       </w:pPr>
       <w:r>
         <w:rPr>
           <w:b/>
         </w:rPr>
-        <w:t>Business Intelligence and Visualization:</w:t>
+        <w:t>Technical Capabilities:</w:t>
       </w:r>
       <w:r>
-        <w:rPr>
-          <w:b w:val="0"/>
-        </w:rPr>
-        <w:t xml:space="preserve"> Tableau, Power BI, SSIS, SSRS, Dashboard Design, KPI and Metric Design</w:t>
+        <w:t>Data Architecture | ETL &amp; API Integration | Reporting Modernization | Business Intelligence | Data Governance | Workflow Automation | KPI &amp; Metric Design | Cross-Functional Leadership | Stakeholder Alignment</w:t>
       </w:r>
     </w:p>
     <w:p>
       <w:pPr>
-        <w:spacing w:after="80"/>
+        <w:spacing w:before="200" w:after="80"/>
+      </w:pPr>
+      <w:r>
+        <w:rPr>
+          <w:b/>
+          <w:color w:val="1F4B99"/>
+          <w:sz w:val="24"/>
+        </w:rPr>
+        <w:t>TECHNICAL SKILLS</w:t>
+      </w:r>
+    </w:p>
+    <w:p>
+      <w:pPr>
+        <w:spacing w:after="60"/>
       </w:pPr>
       <w:r>
         <w:rPr>
           <w:b/>
         </w:rPr>
-        <w:t>Languages and Platforms:</w:t>
+        <w:t>Languages</w:t>
       </w:r>
       <w:r>
-        <w:rPr>
-          <w:b w:val="0"/>
-        </w:rPr>
-        <w:t xml:space="preserve"> SQL, Python, SAS, PowerShell, VB, DAX, SQL Server, PostgreSQL, MySQL, Oracle, SASGRID, AWS, Azure</w:t>
+        <w:t>{SQL, Python, SAS, PowerShell, VB, DAX}</w:t>
       </w:r>
     </w:p>
     <w:p>
       <w:pPr>
-        <w:spacing w:after="80"/>
+        <w:spacing w:after="60"/>
       </w:pPr>
       <w:r>
         <w:rPr>
           <w:b/>
         </w:rPr>
-        <w:t>Tools:</w:t>
+        <w:t>BI &amp; Visualization</w:t>
       </w:r>
       <w:r>
-        <w:rPr>
-          <w:b w:val="0"/>
-        </w:rPr>
-        <w:t xml:space="preserve"> GitHub, ServiceNow, Workday, MS O365, SSMS, DBeaver, VS Code, SAS EGP</w:t>
+        <w:t>{Tableau, Power BI, SSIS, SSRS, Dashboard Design}</w:t>
       </w:r>
     </w:p>
     <w:p>
       <w:pPr>
-        <w:pStyle w:val="Heading1"/>
-        <w:keepNext/>
-        <w:keepLines/>
-        <w:spacing w:before="160" w:after="80"/>
-        <w:ind w:left="0"/>
-      </w:pPr>
-      <w:r>
-        <w:t>Professional Experience</w:t>
-      </w:r>
-    </w:p>
-    <w:p>
-      <w:pPr>
-        <w:spacing w:after="80"/>
+        <w:spacing w:after="60"/>
       </w:pPr>
       <w:r>
         <w:rPr>
           <w:b/>
         </w:rPr>
-        <w:t>Principal Data Engineer</w:t>
+        <w:t>Data Platforms</w:t>
       </w:r>
       <w:r>
+        <w:t>{SQL Server, PostgreSQL, MySQL, Oracle, SASGRID, AWS, Azure}</w:t>
+      </w:r>
+    </w:p>
+    <w:p>
+      <w:pPr>
+        <w:spacing w:after="60"/>
+      </w:pPr>
+      <w:r>
         <w:rPr>
-          <w:b w:val="0"/>
+          <w:b/>
         </w:rPr>
-        <w:t xml:space="preserve"> | Information Security | Fifth Third Bank | Cincinnati, OH | 2022-2026</w:t>
+        <w:t>Automation &amp; Integration</w:t>
+      </w:r>
+      <w:r>
+        <w:t>{ETL, API Integration, Workflow Automation, SaaS Integrations}</w:t>
+      </w:r>
+    </w:p>
+    <w:p>
+      <w:pPr>
+        <w:spacing w:after="60"/>
+      </w:pPr>
+      <w:r>
+        <w:rPr>
+          <w:b/>
+        </w:rPr>
+        <w:t>Tools</w:t>
+      </w:r>
+      <w:r>
+        <w:t>{GitHub, ServiceNow, Workday, MS O365, SSMS, DBeaver, VS Code, SAS EGP}</w:t>
+      </w:r>
+    </w:p>
+    <w:p>
+      <w:pPr>
+        <w:spacing w:before="200" w:after="80"/>
+      </w:pPr>
+      <w:r>
+        <w:rPr>
+          <w:b/>
+          <w:color w:val="1F4B99"/>
+          <w:sz w:val="24"/>
+        </w:rPr>
+        <w:t>PROFESSIONAL EXPERIENCE</w:t>
+      </w:r>
+    </w:p>
+    <w:p>
+      <w:pPr>
+        <w:spacing w:before="160" w:after="20"/>
+      </w:pPr>
+      <w:r>
+        <w:rPr>
+          <w:b/>
+          <w:sz w:val="21"/>
+        </w:rPr>
+        <w:t>Principal Data Engineer, Information Security | Fifth Third Bank | Cincinnati, OH 2022–2026</w:t>
+      </w:r>
+    </w:p>
+    <w:p>
+      <w:pPr>
+        <w:spacing w:after="60"/>
+        <w:ind w:left="288"/>
+      </w:pPr>
+      <w:r>
+        <w:rPr>
+          <w:i/>
+        </w:rPr>
+        <w:t>Strategic Analytics: From Visibility to Action</w:t>
       </w:r>
     </w:p>
     <w:p>
       <w:pPr>
         <w:pStyle w:val="ListBullet"/>
-        <w:spacing w:after="0"/>
-        <w:ind w:left="0" w:hanging="173"/>
+        <w:spacing w:after="60"/>
+        <w:ind w:left="576"/>
       </w:pPr>
       <w:r>
-        <w:rPr>
-          <w:sz w:val="21"/>
-        </w:rPr>
-        <w:t>Led enterprise metric and reporting modernization in a regulated financial environment, improving governance, accountability, and executive visibility.</w:t>
+        <w:t>Modernized enterprise reporting to accelerate risk decision-making</w:t>
       </w:r>
     </w:p>
     <w:p>
       <w:pPr>
         <w:pStyle w:val="ListBullet"/>
-        <w:spacing w:after="0"/>
-        <w:ind w:left="0" w:hanging="173"/>
+        <w:spacing w:after="60"/>
+        <w:ind w:left="576"/>
       </w:pPr>
       <w:r>
-        <w:rPr>
-          <w:sz w:val="21"/>
-        </w:rPr>
-        <w:t>Drove a Tableau-to-Power BI transformation, standardizing reporting patterns and improving consistency for operational and leadership stakeholders.</w:t>
+        <w:t>Unified reporting platform to drive stakeholder alignment</w:t>
       </w:r>
     </w:p>
     <w:p>
       <w:pPr>
         <w:pStyle w:val="ListBullet"/>
-        <w:spacing w:after="0"/>
-        <w:ind w:left="0" w:hanging="173"/>
+        <w:spacing w:after="60"/>
+        <w:ind w:left="576"/>
       </w:pPr>
       <w:r>
-        <w:rPr>
-          <w:sz w:val="21"/>
-        </w:rPr>
-        <w:t>Designed and delivered executive-facing visualizations and KPI frameworks that translated complex security data into clear, decision-ready narratives.</w:t>
+        <w:t>Translated complexity into clarity for decision-makers</w:t>
       </w:r>
     </w:p>
     <w:p>
       <w:pPr>
         <w:pStyle w:val="ListBullet"/>
-        <w:spacing w:after="0"/>
-        <w:ind w:left="0" w:hanging="173"/>
+        <w:spacing w:after="60"/>
+        <w:ind w:left="576"/>
       </w:pPr>
       <w:r>
-        <w:rPr>
-          <w:sz w:val="21"/>
-        </w:rPr>
-        <w:t>Resolved cross-functional data quality and identity issues across AD, LDAP, and Entra ID to improve trust in critical reporting pipelines.</w:t>
-      </w:r>
-    </w:p>
-    <w:p>
-      <w:pPr>
-        <w:spacing w:after="80"/>
-      </w:pPr>
-      <w:r>
-        <w:rPr>
-          <w:b/>
-        </w:rPr>
-        <w:t>Lead Data Engineer</w:t>
-      </w:r>
-      <w:r>
-        <w:rPr>
-          <w:b w:val="0"/>
-        </w:rPr>
-        <w:t xml:space="preserve"> | Information Security | Fifth Third Bank | Cincinnati, OH | 2020-2022</w:t>
+        <w:t>Built trust through data quality</w:t>
       </w:r>
     </w:p>
     <w:p>
       <w:pPr>
         <w:pStyle w:val="ListBullet"/>
-        <w:spacing w:after="0"/>
-        <w:ind w:left="0" w:hanging="173"/>
+        <w:spacing w:after="60"/>
+        <w:ind w:left="576"/>
       </w:pPr>
       <w:r>
-        <w:rPr>
-          <w:sz w:val="21"/>
-        </w:rPr>
-        <w:t>Built and automated SAS-based warehouse and reporting workflows using REST APIs and PowerShell orchestration to improve reliability and reduce manual processing.</w:t>
+        <w:t>Scaled efficiency through automation</w:t>
       </w:r>
     </w:p>
     <w:p>
       <w:pPr>
         <w:pStyle w:val="ListBullet"/>
-        <w:spacing w:after="0"/>
-        <w:ind w:left="0" w:hanging="173"/>
+        <w:spacing w:after="60"/>
+        <w:ind w:left="576"/>
+      </w:pPr>
+      <w:r>
+        <w:t>Extended impact through leadership</w:t>
+      </w:r>
+    </w:p>
+    <w:p>
+      <w:pPr>
+        <w:spacing w:before="160" w:after="20"/>
       </w:pPr>
       <w:r>
         <w:rPr>
+          <w:b/>
           <w:sz w:val="21"/>
         </w:rPr>
-        <w:t>Delivered compliance, audit, and risk analytics to support governance decisions and executive reporting across information security teams.</w:t>
+        <w:t>Lead Data Engineer, Information Security | Fifth Third Bank | Cincinnati, OH 2020–2022</w:t>
+      </w:r>
+    </w:p>
+    <w:p>
+      <w:pPr>
+        <w:spacing w:after="60"/>
+        <w:ind w:left="288"/>
+      </w:pPr>
+      <w:r>
+        <w:rPr>
+          <w:i/>
+        </w:rPr>
+        <w:t>Platform Modernization as Risk Mitigation</w:t>
       </w:r>
     </w:p>
     <w:p>
       <w:pPr>
         <w:pStyle w:val="ListBullet"/>
-        <w:spacing w:after="0"/>
-        <w:ind w:left="0" w:hanging="173"/>
+        <w:spacing w:after="60"/>
+        <w:ind w:left="576"/>
       </w:pPr>
       <w:r>
-        <w:rPr>
-          <w:sz w:val="21"/>
-        </w:rPr>
-        <w:t>Created reporting structures and visual explanations that made complex compliance data accessible to non-technical stakeholders and leadership.</w:t>
-      </w:r>
-    </w:p>
-    <w:p>
-      <w:pPr>
-        <w:spacing w:after="80"/>
-      </w:pPr>
-      <w:r>
-        <w:rPr>
-          <w:b/>
-        </w:rPr>
-        <w:t>Business Data Reporting Analyst</w:t>
-      </w:r>
-      <w:r>
-        <w:rPr>
-          <w:b w:val="0"/>
-        </w:rPr>
-        <w:t xml:space="preserve"> | Information Security | Fifth Third Bank | Cincinnati, OH | 2019-2020</w:t>
+        <w:t>Eliminated operational risk through automation</w:t>
       </w:r>
     </w:p>
     <w:p>
       <w:pPr>
         <w:pStyle w:val="ListBullet"/>
-        <w:spacing w:after="0"/>
-        <w:ind w:left="0" w:hanging="173"/>
+        <w:spacing w:after="60"/>
+        <w:ind w:left="576"/>
       </w:pPr>
       <w:r>
-        <w:rPr>
-          <w:sz w:val="21"/>
-        </w:rPr>
-        <w:t>Expanded and redesigned the information security metric program to create more reliable reporting processes for leadership and operational stakeholders.</w:t>
+        <w:t>Strengthened governance decisions with reliable analytics</w:t>
       </w:r>
     </w:p>
     <w:p>
       <w:pPr>
         <w:pStyle w:val="ListBullet"/>
-        <w:spacing w:after="0"/>
-        <w:ind w:left="0" w:hanging="173"/>
+        <w:spacing w:after="60"/>
+        <w:ind w:left="576"/>
       </w:pPr>
       <w:r>
-        <w:rPr>
-          <w:sz w:val="21"/>
-        </w:rPr>
-        <w:t>Transformed ad hoc Excel workflows into a repeatable data pipeline using directory-based ingestion, NAS storage, and SAS Grid processing.</w:t>
+        <w:t>Made complexity accessible to non-technical decision-makers</w:t>
       </w:r>
     </w:p>
     <w:p>
       <w:pPr>
         <w:pStyle w:val="ListBullet"/>
-        <w:spacing w:after="0"/>
-        <w:ind w:left="0" w:hanging="173"/>
+        <w:spacing w:after="60"/>
+        <w:ind w:left="576"/>
       </w:pPr>
       <w:r>
-        <w:rPr>
-          <w:sz w:val="21"/>
-        </w:rPr>
-        <w:t>Built reporting and visualization structures that turned raw technical metrics into clearer decision narratives for security, risk, and governance teams.</w:t>
-      </w:r>
-    </w:p>
-    <w:p>
-      <w:pPr>
-        <w:spacing w:after="80"/>
-      </w:pPr>
-      <w:r>
-        <w:rPr>
-          <w:b/>
-        </w:rPr>
-        <w:t>Contact Center Reporting and Analytics Manager</w:t>
-      </w:r>
-      <w:r>
-        <w:rPr>
-          <w:b w:val="0"/>
-        </w:rPr>
-        <w:t xml:space="preserve"> | Operations | Fifth Third Bank | Cincinnati, OH | 2017-2019</w:t>
+        <w:t>Built for scale and sustainability</w:t>
       </w:r>
     </w:p>
     <w:p>
       <w:pPr>
         <w:pStyle w:val="ListBullet"/>
-        <w:spacing w:after="0"/>
-        <w:ind w:left="0" w:hanging="173"/>
+        <w:spacing w:after="60"/>
+        <w:ind w:left="576"/>
+      </w:pPr>
+      <w:r>
+        <w:t>Built team capability for sustained delivery</w:t>
+      </w:r>
+    </w:p>
+    <w:p>
+      <w:pPr>
+        <w:spacing w:before="160" w:after="20"/>
       </w:pPr>
       <w:r>
         <w:rPr>
+          <w:b/>
           <w:sz w:val="21"/>
         </w:rPr>
-        <w:t>Led reporting and analytics for customer operations, providing leadership with actionable performance metrics and process improvement guidance.</w:t>
+        <w:t>Business Data Reporting Analyst, Information Security | Fifth Third Bank | Cincinnati, OH 2019–2020</w:t>
+      </w:r>
+    </w:p>
+    <w:p>
+      <w:pPr>
+        <w:spacing w:after="60"/>
+        <w:ind w:left="288"/>
+      </w:pPr>
+      <w:r>
+        <w:rPr>
+          <w:i/>
+        </w:rPr>
+        <w:t>Foundation for Trusted Security Analytics</w:t>
       </w:r>
     </w:p>
     <w:p>
       <w:pPr>
         <w:pStyle w:val="ListBullet"/>
-        <w:spacing w:after="0"/>
-        <w:ind w:left="0" w:hanging="173"/>
+        <w:spacing w:after="60"/>
+        <w:ind w:left="576"/>
       </w:pPr>
       <w:r>
-        <w:rPr>
-          <w:sz w:val="21"/>
-        </w:rPr>
-        <w:t>Built and supported an internal analytics platform used to monitor operational efficiency, service quality, and customer experience outcomes.</w:t>
+        <w:t>Redesigned metrics program for business alignment</w:t>
       </w:r>
     </w:p>
     <w:p>
       <w:pPr>
         <w:pStyle w:val="ListBullet"/>
-        <w:spacing w:after="0"/>
-        <w:ind w:left="0" w:hanging="173"/>
+        <w:spacing w:after="60"/>
+        <w:ind w:left="576"/>
       </w:pPr>
       <w:r>
-        <w:rPr>
-          <w:sz w:val="21"/>
-        </w:rPr>
-        <w:t>Created dashboards and visual performance views that translated operational data into clear management narratives for both frontline and executive audiences.</w:t>
-      </w:r>
-    </w:p>
-    <w:p>
-      <w:pPr>
-        <w:spacing w:after="80"/>
-      </w:pPr>
-      <w:r>
-        <w:rPr>
-          <w:b/>
-        </w:rPr>
-        <w:t>Application Developer</w:t>
-      </w:r>
-      <w:r>
-        <w:rPr>
-          <w:b w:val="0"/>
-        </w:rPr>
-        <w:t xml:space="preserve"> | Information Technology | Fifth Third Bank | Cincinnati, OH | 2017</w:t>
+        <w:t>Scaled metrics without scaling manual effort</w:t>
       </w:r>
     </w:p>
     <w:p>
       <w:pPr>
         <w:pStyle w:val="ListBullet"/>
-        <w:spacing w:after="0"/>
-        <w:ind w:left="0" w:hanging="173"/>
+        <w:spacing w:after="60"/>
+        <w:ind w:left="576"/>
+      </w:pPr>
+      <w:r>
+        <w:t>Connected technical metrics to business narratives</w:t>
+      </w:r>
+    </w:p>
+    <w:p>
+      <w:pPr>
+        <w:spacing w:before="160" w:after="20"/>
       </w:pPr>
       <w:r>
         <w:rPr>
+          <w:b/>
           <w:sz w:val="21"/>
         </w:rPr>
+        <w:t>Contact Center Reporting &amp; Analytics Manager, Operations | Fifth Third Bank | Cincinnati, OH 2017–2019</w:t>
+      </w:r>
+    </w:p>
+    <w:p>
+      <w:pPr>
+        <w:spacing w:after="60"/>
+        <w:ind w:left="288"/>
+      </w:pPr>
+      <w:r>
+        <w:rPr>
+          <w:i/>
+        </w:rPr>
+        <w:t>Analytics-Driven Operational Excellence</w:t>
+      </w:r>
+    </w:p>
+    <w:p>
+      <w:pPr>
+        <w:pStyle w:val="ListBullet"/>
+        <w:spacing w:after="60"/>
+        <w:ind w:left="576"/>
+      </w:pPr>
+      <w:r>
+        <w:t>Transformed operations through data-driven leadership</w:t>
+      </w:r>
+    </w:p>
+    <w:p>
+      <w:pPr>
+        <w:pStyle w:val="ListBullet"/>
+        <w:spacing w:after="60"/>
+        <w:ind w:left="576"/>
+      </w:pPr>
+      <w:r>
+        <w:t>Built shared visibility across the organization</w:t>
+      </w:r>
+    </w:p>
+    <w:p>
+      <w:pPr>
+        <w:pStyle w:val="ListBullet"/>
+        <w:spacing w:after="60"/>
+        <w:ind w:left="576"/>
+      </w:pPr>
+      <w:r>
+        <w:t>Made performance tangible across all levels</w:t>
+      </w:r>
+    </w:p>
+    <w:p>
+      <w:pPr>
+        <w:pStyle w:val="ListBullet"/>
+        <w:spacing w:after="60"/>
+        <w:ind w:left="576"/>
+      </w:pPr>
+      <w:r>
+        <w:t>Leveraged technology for competitive advantage</w:t>
+      </w:r>
+    </w:p>
+    <w:p>
+      <w:pPr>
+        <w:pStyle w:val="ListBullet"/>
+        <w:spacing w:after="60"/>
+        <w:ind w:left="576"/>
+      </w:pPr>
+      <w:r>
+        <w:t>Built high-performing team culture</w:t>
+      </w:r>
+    </w:p>
+    <w:p>
+      <w:pPr>
+        <w:spacing w:before="160" w:after="20"/>
+      </w:pPr>
+      <w:r>
+        <w:rPr>
+          <w:b/>
+          <w:sz w:val="21"/>
+        </w:rPr>
+        <w:t>Application Developer, Information Technology | Fifth Third Bank | Cincinnati, OH 2017</w:t>
+      </w:r>
+    </w:p>
+    <w:p>
+      <w:pPr>
+        <w:spacing w:after="60"/>
+        <w:ind w:left="288"/>
+      </w:pPr>
+      <w:r>
+        <w:rPr>
+          <w:i/>
+        </w:rPr>
+        <w:t>Systems Integration &amp; Application Support</w:t>
+      </w:r>
+    </w:p>
+    <w:p>
+      <w:pPr>
+        <w:pStyle w:val="ListBullet"/>
+        <w:spacing w:after="60"/>
+        <w:ind w:left="576"/>
+      </w:pPr>
+      <w:r>
         <w:t>Supported legacy application migration and modernization efforts, improving compatibility and operational stability.</w:t>
       </w:r>
     </w:p>
     <w:p>
       <w:pPr>
         <w:pStyle w:val="ListBullet"/>
-        <w:spacing w:after="0"/>
-        <w:ind w:left="0" w:hanging="173"/>
+        <w:spacing w:after="60"/>
+        <w:ind w:left="576"/>
       </w:pPr>
       <w:r>
-        <w:rPr>
-          <w:sz w:val="21"/>
-        </w:rPr>
         <w:t>Partnered with business and technical stakeholders to validate requirements, update scripts, and streamline application support processes.</w:t>
       </w:r>
     </w:p>
     <w:p>
       <w:pPr>
-        <w:spacing w:after="80"/>
+        <w:spacing w:before="160" w:after="20"/>
       </w:pPr>
       <w:r>
         <w:rPr>
           <w:b/>
+          <w:sz w:val="21"/>
         </w:rPr>
-        <w:t>Reporting Specialist II</w:t>
+        <w:t>Reporting Specialist II, Operations | Fifth Third Bank | Cincinnati, OH 2015–2017</w:t>
       </w:r>
+    </w:p>
+    <w:p>
+      <w:pPr>
+        <w:spacing w:after="60"/>
+        <w:ind w:left="288"/>
+      </w:pPr>
       <w:r>
         <w:rPr>
-          <w:b w:val="0"/>
+          <w:i/>
         </w:rPr>
-        <w:t xml:space="preserve"> | Operations | Fifth Third Bank | Cincinnati, OH | 2015-2017</w:t>
+        <w:t>Democratizing Data for Faster Decisions</w:t>
       </w:r>
     </w:p>
     <w:p>
       <w:pPr>
         <w:pStyle w:val="ListBullet"/>
-        <w:spacing w:after="0"/>
-        <w:ind w:left="0" w:hanging="173"/>
+        <w:spacing w:after="60"/>
+        <w:ind w:left="576"/>
       </w:pPr>
       <w:r>
-        <w:rPr>
-          <w:sz w:val="21"/>
-        </w:rPr>
-        <w:t>Created and maintained BI and operational reporting solutions for customer service, workforce, and performance metrics using SSIS and SSRS.</w:t>
+        <w:t>Centralized operational visibility through reporting modernization</w:t>
       </w:r>
     </w:p>
     <w:p>
       <w:pPr>
         <w:pStyle w:val="ListBullet"/>
-        <w:spacing w:after="0"/>
-        <w:ind w:left="0" w:hanging="173"/>
+        <w:spacing w:after="60"/>
+        <w:ind w:left="576"/>
       </w:pPr>
       <w:r>
-        <w:rPr>
-          <w:sz w:val="21"/>
-        </w:rPr>
-        <w:t>Developed self-service reporting capabilities that expanded access to scorecards, trend analysis, and workforce metrics across the organization.</w:t>
+        <w:t>Enabled faster decisions at all levels</w:t>
       </w:r>
     </w:p>
     <w:p>
       <w:pPr>
         <w:pStyle w:val="ListBullet"/>
-        <w:spacing w:after="0"/>
-        <w:ind w:left="0" w:hanging="173"/>
+        <w:spacing w:after="60"/>
+        <w:ind w:left="576"/>
       </w:pPr>
       <w:r>
-        <w:rPr>
-          <w:sz w:val="21"/>
-        </w:rPr>
-        <w:t>Built operational dashboards and visual analyses that helped leaders understand performance patterns and respond quickly to emerging issues.</w:t>
-      </w:r>
-    </w:p>
-    <w:p>
-      <w:pPr>
-        <w:spacing w:after="80"/>
-      </w:pPr>
-      <w:r>
-        <w:rPr>
-          <w:b/>
-        </w:rPr>
-        <w:t>eBG Reporting Analyst</w:t>
-      </w:r>
-      <w:r>
-        <w:rPr>
-          <w:b w:val="0"/>
-        </w:rPr>
-        <w:t xml:space="preserve"> | Operations | Axcess Financial | Cincinnati, OH | 2012-2015</w:t>
+        <w:t>Built real-time operational awareness</w:t>
       </w:r>
     </w:p>
     <w:p>
       <w:pPr>
         <w:pStyle w:val="ListBullet"/>
-        <w:spacing w:after="0"/>
-        <w:ind w:left="0" w:hanging="173"/>
+        <w:spacing w:after="60"/>
+        <w:ind w:left="576"/>
+      </w:pPr>
+      <w:r>
+        <w:t>Turned anomalies into action</w:t>
+      </w:r>
+    </w:p>
+    <w:p>
+      <w:pPr>
+        <w:spacing w:before="160" w:after="20"/>
       </w:pPr>
       <w:r>
         <w:rPr>
+          <w:b/>
           <w:sz w:val="21"/>
         </w:rPr>
-        <w:t>Built scorecard, incentive, and workforce reporting solutions that improved visibility into operational performance and key drivers.</w:t>
+        <w:t>eBG Reporting Analyst, Operations | Axcess Financial | Cincinnati, OH 2012–2015</w:t>
+      </w:r>
+    </w:p>
+    <w:p>
+      <w:pPr>
+        <w:spacing w:after="60"/>
+        <w:ind w:left="288"/>
+      </w:pPr>
+      <w:r>
+        <w:rPr>
+          <w:i/>
+        </w:rPr>
+        <w:t>Building Operational Intelligence from Ground Up</w:t>
       </w:r>
     </w:p>
     <w:p>
       <w:pPr>
         <w:pStyle w:val="ListBullet"/>
-        <w:spacing w:after="0"/>
-        <w:ind w:left="0" w:hanging="173"/>
+        <w:spacing w:after="60"/>
+        <w:ind w:left="576"/>
       </w:pPr>
       <w:r>
-        <w:rPr>
-          <w:sz w:val="21"/>
-        </w:rPr>
-        <w:t>Automated payroll and operational reporting workflows, reducing manual effort and improving consistency across stakeholder groups.</w:t>
+        <w:t>Aligned incentives with business priorities through analytics</w:t>
       </w:r>
     </w:p>
     <w:p>
       <w:pPr>
         <w:pStyle w:val="ListBullet"/>
-        <w:spacing w:after="0"/>
-        <w:ind w:left="0" w:hanging="173"/>
+        <w:spacing w:after="60"/>
+        <w:ind w:left="576"/>
       </w:pPr>
       <w:r>
-        <w:rPr>
-          <w:sz w:val="21"/>
-        </w:rPr>
-        <w:t>Translated business requirements into repeatable reporting products that supported customer service operations and leadership decisions.</w:t>
+        <w:t>Reduced operational overhead through automation</w:t>
       </w:r>
     </w:p>
     <w:p>
       <w:pPr>
-        <w:pStyle w:val="Heading1"/>
-        <w:keepNext/>
-        <w:keepLines/>
-        <w:spacing w:before="160" w:after="80"/>
-        <w:ind w:left="0"/>
+        <w:pStyle w:val="ListBullet"/>
+        <w:spacing w:after="60"/>
+        <w:ind w:left="576"/>
       </w:pPr>
       <w:r>
-        <w:t>Education</w:t>
+        <w:t>Delivered repeatability as competitive advantage</w:t>
       </w:r>
     </w:p>
     <w:p>
       <w:pPr>
-        <w:spacing w:after="80"/>
+        <w:spacing w:before="200" w:after="80"/>
       </w:pPr>
       <w:r>
         <w:rPr>
-          <w:b w:val="0"/>
+          <w:b/>
+          <w:color w:val="1F4B99"/>
+          <w:sz w:val="24"/>
         </w:rPr>
-        <w:t>University of Cincinnati - Coursework in Cultural Anthropology, 2007-2009</w:t>
+        <w:t>EDUCATION</w:t>
       </w:r>
     </w:p>
     <w:p>
       <w:pPr>
-        <w:spacing w:after="80"/>
+        <w:pStyle w:val="ListBullet"/>
+        <w:spacing w:after="20"/>
       </w:pPr>
       <w:r>
-        <w:rPr>
-          <w:b w:val="0"/>
-        </w:rPr>
-        <w:t>Cincinnati State - Coursework in Computer Networking, 2010-2011</w:t>
+        <w:t>University of Cincinnati — Coursework in Cultural Anthropology, 2007–2009</w:t>
       </w:r>
     </w:p>
     <w:p>
       <w:pPr>
-        <w:spacing w:after="80"/>
+        <w:pStyle w:val="ListBullet"/>
+        <w:spacing w:after="20"/>
       </w:pPr>
       <w:r>
-        <w:rPr>
-          <w:b w:val="0"/>
-        </w:rPr>
-        <w:t>Fifth Third Bank - Information Security Leadership Program, 2022-2023</w:t>
+        <w:t>Cincinnati State — Coursework in Computer Networking, 2010–2011</w:t>
       </w:r>
     </w:p>
     <w:p>
       <w:pPr>
-        <w:pStyle w:val="Heading1"/>
-        <w:keepNext/>
-        <w:keepLines/>
-        <w:spacing w:before="160" w:after="80"/>
-        <w:ind w:left="0"/>
+        <w:pStyle w:val="ListBullet"/>
+        <w:spacing w:after="20"/>
       </w:pPr>
       <w:r>
-        <w:t>Awards</w:t>
+        <w:t>Fifth Third Bank — Information Security Leadership Program, 2022–2023</w:t>
       </w:r>
     </w:p>
     <w:p>
       <w:pPr>
-        <w:spacing w:after="80"/>
+        <w:spacing w:before="200" w:after="80"/>
       </w:pPr>
       <w:r>
         <w:rPr>
-          <w:b w:val="0"/>
+          <w:b/>
+          <w:color w:val="1F4B99"/>
+          <w:sz w:val="24"/>
         </w:rPr>
-        <w:t>Horizon Award - Fifth Third Bank (2022)</w:t>
+        <w:t>AWARDS</w:t>
       </w:r>
     </w:p>
     <w:p>
       <w:pPr>
-        <w:spacing w:after="80"/>
+        <w:pStyle w:val="ListBullet"/>
+        <w:spacing w:after="20"/>
+      </w:pPr>
+      <w:r>
+        <w:t>Horizon Award — Fifth Third Bank (2022)</w:t>
+      </w:r>
+    </w:p>
+    <w:p>
+      <w:pPr>
+        <w:pStyle w:val="ListBullet"/>
+        <w:spacing w:after="20"/>
+      </w:pPr>
+      <w:r>
+        <w:t>Spirit of the Pin — Fifth Third Bank (multiple years)</w:t>
+      </w:r>
+    </w:p>
+    <w:p/>
+    <w:p>
+      <w:pPr>
+        <w:spacing w:before="200" w:after="80"/>
       </w:pPr>
       <w:r>
         <w:rPr>
-          <w:b w:val="0"/>
+          <w:b/>
+          <w:color w:val="1F4B99"/>
+          <w:sz w:val="24"/>
         </w:rPr>
-        <w:t>Spirit of the Pin - Fifth Third Bank (multiple years)</w:t>
+        <w:t>CORE KEYWORDS</w:t>
+      </w:r>
+    </w:p>
+    <w:p>
+      <w:pPr>
+        <w:spacing w:after="40"/>
+      </w:pPr>
+      <w:r>
+        <w:t>Keywords: Data Engineering, Data Architecture, Analytics Leadership, Business Intelligence, ETL, API Integration, Data Governance, Data Quality, Workflow Automation, Reporting Modernization, KPI Design, Executive Reporting, Stakeholder Alignment, Cross-Functional Leadership, Risk &amp; Compliance, SQL, Python, SAS, PowerShell, DAX, Tableau, Power BI, SSIS, SSRS, SQL Server, PostgreSQL, MySQL, Oracle, AWS, Azure, ServiceNow, Workday, GitHub</w:t>
       </w:r>
     </w:p>
     <w:sectPr>
       <w:pgSz w:w="12240" w:h="15840"/>
-      <w:pgMar w:top="792" w:right="1008" w:bottom="792" w:left="1008" w:header="720" w:footer="720" w:gutter="0"/>
+      <w:pgMar w:top="720" w:right="1080" w:bottom="720" w:left="1080" w:header="720" w:footer="720" w:gutter="0"/>
       <w:cols w:space="720"/>
       <w:docGrid w:linePitch="360"/>
     </w:sectPr>
@@ -1073,10 +1131,6 @@
     <w:name w:val="Normal"/>
     <w:qFormat/>
     <w:rsid w:val="00FC693F"/>
-    <w:rPr>
-      <w:rFonts w:ascii="Calibri" w:hAnsi="Calibri"/>
-      <w:sz w:val="22"/>
-    </w:rPr>
   </w:style>
   <w:style w:type="paragraph" w:styleId="Header">
     <w:name w:val="header"/>
@@ -1137,11 +1191,11 @@
       <w:outlineLvl w:val="0"/>
     </w:pPr>
     <w:rPr>
-      <w:rFonts w:asciiTheme="majorHAnsi" w:eastAsiaTheme="majorEastAsia" w:hAnsiTheme="majorHAnsi" w:cstheme="majorBidi" w:ascii="Calibri" w:hAnsi="Calibri"/>
+      <w:rFonts w:asciiTheme="majorHAnsi" w:eastAsiaTheme="majorEastAsia" w:hAnsiTheme="majorHAnsi" w:cstheme="majorBidi"/>
       <w:b/>
       <w:bCs/>
       <w:color w:val="365F91" w:themeColor="accent1" w:themeShade="BF"/>
-      <w:sz w:val="27"/>
+      <w:sz w:val="28"/>
       <w:szCs w:val="28"/>
     </w:rPr>
   </w:style>
@@ -1161,11 +1215,11 @@
       <w:outlineLvl w:val="1"/>
     </w:pPr>
     <w:rPr>
-      <w:rFonts w:asciiTheme="majorHAnsi" w:eastAsiaTheme="majorEastAsia" w:hAnsiTheme="majorHAnsi" w:cstheme="majorBidi" w:ascii="Calibri" w:hAnsi="Calibri"/>
+      <w:rFonts w:asciiTheme="majorHAnsi" w:eastAsiaTheme="majorEastAsia" w:hAnsiTheme="majorHAnsi" w:cstheme="majorBidi"/>
       <w:b/>
       <w:bCs/>
       <w:color w:val="4F81BD" w:themeColor="accent1"/>
-      <w:sz w:val="25"/>
+      <w:sz w:val="26"/>
       <w:szCs w:val="26"/>
     </w:rPr>
   </w:style>
@@ -1185,11 +1239,10 @@
       <w:outlineLvl w:val="2"/>
     </w:pPr>
     <w:rPr>
-      <w:rFonts w:asciiTheme="majorHAnsi" w:eastAsiaTheme="majorEastAsia" w:hAnsiTheme="majorHAnsi" w:cstheme="majorBidi" w:ascii="Calibri" w:hAnsi="Calibri"/>
+      <w:rFonts w:asciiTheme="majorHAnsi" w:eastAsiaTheme="majorEastAsia" w:hAnsiTheme="majorHAnsi" w:cstheme="majorBidi"/>
       <w:b/>
       <w:bCs/>
       <w:color w:val="4F81BD" w:themeColor="accent1"/>
-      <w:sz w:val="23"/>
     </w:rPr>
   </w:style>
   <w:style w:type="paragraph" w:styleId="Heading4">
@@ -1209,13 +1262,12 @@
       <w:outlineLvl w:val="3"/>
     </w:pPr>
     <w:rPr>
-      <w:rFonts w:asciiTheme="majorHAnsi" w:eastAsiaTheme="majorEastAsia" w:hAnsiTheme="majorHAnsi" w:cstheme="majorBidi" w:ascii="Calibri" w:hAnsi="Calibri"/>
+      <w:rFonts w:asciiTheme="majorHAnsi" w:eastAsiaTheme="majorEastAsia" w:hAnsiTheme="majorHAnsi" w:cstheme="majorBidi"/>
       <w:b/>
       <w:bCs/>
       <w:i/>
       <w:iCs/>
       <w:color w:val="4F81BD" w:themeColor="accent1"/>
-      <w:sz w:val="22"/>
     </w:rPr>
   </w:style>
   <w:style w:type="paragraph" w:styleId="Heading5">
@@ -1235,10 +1287,8 @@
       <w:outlineLvl w:val="4"/>
     </w:pPr>
     <w:rPr>
-      <w:rFonts w:asciiTheme="majorHAnsi" w:eastAsiaTheme="majorEastAsia" w:hAnsiTheme="majorHAnsi" w:cstheme="majorBidi" w:ascii="Calibri" w:hAnsi="Calibri"/>
-      <w:b/>
+      <w:rFonts w:asciiTheme="majorHAnsi" w:eastAsiaTheme="majorEastAsia" w:hAnsiTheme="majorHAnsi" w:cstheme="majorBidi"/>
       <w:color w:val="243F60" w:themeColor="accent1" w:themeShade="7F"/>
-      <w:sz w:val="21"/>
     </w:rPr>
   </w:style>
   <w:style w:type="paragraph" w:styleId="Heading6">
@@ -1258,12 +1308,10 @@
       <w:outlineLvl w:val="5"/>
     </w:pPr>
     <w:rPr>
-      <w:rFonts w:asciiTheme="majorHAnsi" w:eastAsiaTheme="majorEastAsia" w:hAnsiTheme="majorHAnsi" w:cstheme="majorBidi" w:ascii="Calibri" w:hAnsi="Calibri"/>
-      <w:b/>
+      <w:rFonts w:asciiTheme="majorHAnsi" w:eastAsiaTheme="majorEastAsia" w:hAnsiTheme="majorHAnsi" w:cstheme="majorBidi"/>
       <w:i/>
       <w:iCs/>
       <w:color w:val="243F60" w:themeColor="accent1" w:themeShade="7F"/>
-      <w:sz w:val="20"/>
     </w:rPr>
   </w:style>
   <w:style w:type="paragraph" w:styleId="Heading7">

</xml_diff>

<commit_message>
Publish refined resume site with detailed ATS and one-page PDF downloads
Expand confirmed skills and domain experience, improve responsive banded layout and collapsed skills, align document links and fonts, and enforce native downloads while preserving GA4 and the existing Pages URL.

Co-authored-by: Copilot <223556219+Copilot@users.noreply.github.com>
</commit_message>
<xml_diff>
--- a/Micah-Willins-ATS.docx
+++ b/Micah-Willins-ATS.docx
@@ -35,32 +35,47 @@
         <w:rPr>
           <w:sz w:val="20"/>
         </w:rPr>
-        <w:t xml:space="preserve">(513) 313-4820 | Micah.Willins.88@gmail.com | Cincinnati, OH  |  </w:t>
+        <w:t>(513) 313-4820 | Micah.Willins.88@gmail.com | Cincinnati, OH</w:t>
       </w:r>
+    </w:p>
+    <w:p>
+      <w:pPr>
+        <w:jc w:val="center"/>
+      </w:pPr>
       <w:hyperlink r:id="rId9">
         <w:r>
           <w:rPr>
             <w:color w:val="0563C1"/>
-            <w:u/>
+            <w:rFonts w:ascii="Aptos Narrow" w:hAnsi="Aptos Narrow" w:eastAsia="Aptos Narrow" w:cs="Aptos Narrow"/>
+            <w:sz w:val="15"/>
+            <w:i/>
           </w:rPr>
           <w:t>LinkedIn</w:t>
         </w:r>
       </w:hyperlink>
       <w:r>
-        <w:t xml:space="preserve">  |  </w:t>
+        <w:rPr>
+          <w:rFonts w:ascii="Aptos Narrow" w:hAnsi="Aptos Narrow"/>
+          <w:i/>
+          <w:sz w:val="15"/>
+        </w:rPr>
+        <w:t xml:space="preserve"> | </w:t>
       </w:r>
       <w:hyperlink r:id="rId10">
         <w:r>
           <w:rPr>
             <w:color w:val="0563C1"/>
-            <w:u/>
+            <w:rFonts w:ascii="Aptos Narrow" w:hAnsi="Aptos Narrow" w:eastAsia="Aptos Narrow" w:cs="Aptos Narrow"/>
+            <w:sz w:val="15"/>
+            <w:i/>
           </w:rPr>
-          <w:t>View Full Details &amp; References</w:t>
+          <w:t>View Hosted Resume for detailed specifics, verified references, and documented award samples</w:t>
         </w:r>
       </w:hyperlink>
     </w:p>
     <w:p>
       <w:pPr>
+        <w:keepNext/>
         <w:spacing w:before="200" w:after="80"/>
       </w:pPr>
       <w:r>
@@ -77,11 +92,15 @@
         <w:spacing w:after="60"/>
       </w:pPr>
       <w:r>
+        <w:rPr>
+          <w:rFonts w:ascii="Aptos Display" w:hAnsi="Aptos Display"/>
+        </w:rPr>
         <w:t>Data and analytics leader with 14+ years of experience translating technical infrastructure into strategic business advantage. Proven track record of modernizing data platforms and reporting systems that accelerate decision-making, reduce operational risk, and improve organizational alignment. Expertise in designing governance frameworks and trusted analytics that enable leadership to act on complex data with confidence. Bridges the gap between technical execution and business outcomes—consistently identifying where infrastructure investments yield measurable returns in efficiency, compliance, and strategic clarity.</w:t>
       </w:r>
     </w:p>
     <w:p>
       <w:pPr>
+        <w:keepNext/>
         <w:spacing w:before="200" w:after="80"/>
       </w:pPr>
       <w:r>
@@ -95,34 +114,49 @@
     </w:p>
     <w:p>
       <w:pPr>
-        <w:spacing w:after="60"/>
+        <w:keepLines/>
+        <w:spacing w:before="80" w:after="80"/>
+        <w:shd w:fill="EEF3FA"/>
       </w:pPr>
       <w:r>
         <w:rPr>
+          <w:rFonts w:ascii="Aptos Display" w:hAnsi="Aptos Display"/>
           <w:b/>
+          <w:color w:val="1F4B99"/>
         </w:rPr>
-        <w:t>Business Outcomes:</w:t>
+        <w:t xml:space="preserve">Business Outcomes: </w:t>
       </w:r>
       <w:r>
+        <w:rPr>
+          <w:rFonts w:ascii="Aptos Narrow" w:hAnsi="Aptos Narrow"/>
+        </w:rPr>
         <w:t>Executive Decision Clarity | Risk &amp; Compliance Acceleration | Operational Efficiency | Trust-Based Analytics</w:t>
       </w:r>
     </w:p>
     <w:p>
       <w:pPr>
-        <w:spacing w:after="60"/>
+        <w:keepLines/>
+        <w:spacing w:before="80" w:after="80"/>
+        <w:shd w:fill="FFFFFF"/>
       </w:pPr>
       <w:r>
         <w:rPr>
+          <w:rFonts w:ascii="Aptos Display" w:hAnsi="Aptos Display"/>
           <w:b/>
+          <w:color w:val="1F4B99"/>
         </w:rPr>
-        <w:t>Technical Capabilities:</w:t>
+        <w:t xml:space="preserve">Technical Capabilities: </w:t>
       </w:r>
       <w:r>
+        <w:rPr>
+          <w:rFonts w:ascii="Aptos Narrow" w:hAnsi="Aptos Narrow"/>
+        </w:rPr>
         <w:t>Data Architecture | ETL &amp; API Integration | Reporting Modernization | Business Intelligence | Data Governance | Workflow Automation | KPI &amp; Metric Design | Cross-Functional Leadership | Stakeholder Alignment</w:t>
       </w:r>
     </w:p>
     <w:p>
       <w:pPr>
+        <w:keepNext/>
         <w:spacing w:before="200" w:after="80"/>
       </w:pPr>
       <w:r>
@@ -136,76 +170,364 @@
     </w:p>
     <w:p>
       <w:pPr>
-        <w:spacing w:after="60"/>
+        <w:keepLines/>
+        <w:spacing w:before="80" w:after="80"/>
+        <w:shd w:fill="EEF3FA"/>
       </w:pPr>
       <w:r>
         <w:rPr>
+          <w:rFonts w:ascii="Aptos Display" w:hAnsi="Aptos Display"/>
           <w:b/>
+          <w:color w:val="1F4B99"/>
         </w:rPr>
-        <w:t>Languages</w:t>
+        <w:t xml:space="preserve">Languages &amp; Development: </w:t>
       </w:r>
       <w:r>
-        <w:t>{SQL, Python, SAS, PowerShell, VB, DAX}</w:t>
+        <w:rPr>
+          <w:rFonts w:ascii="Aptos Narrow" w:hAnsi="Aptos Narrow"/>
+        </w:rPr>
+        <w:t>SQL, Python, SAS, PowerShell, Visual Basic, VBA, VB.NET, FastAPI, Docker</w:t>
       </w:r>
     </w:p>
     <w:p>
       <w:pPr>
-        <w:spacing w:after="60"/>
+        <w:keepLines/>
+        <w:spacing w:before="80" w:after="80"/>
+        <w:shd w:fill="FFFFFF"/>
       </w:pPr>
       <w:r>
         <w:rPr>
+          <w:rFonts w:ascii="Aptos Display" w:hAnsi="Aptos Display"/>
           <w:b/>
+          <w:color w:val="1F4B99"/>
         </w:rPr>
-        <w:t>BI &amp; Visualization</w:t>
+        <w:t xml:space="preserve">Data Engineering: </w:t>
       </w:r>
       <w:r>
-        <w:t>{Tableau, Power BI, SSIS, SSRS, Dashboard Design}</w:t>
+        <w:rPr>
+          <w:rFonts w:ascii="Aptos Narrow" w:hAnsi="Aptos Narrow"/>
+        </w:rPr>
+        <w:t>ETL/ELT, REST APIs, SaaS Integration, Pipeline Orchestration, Incremental Loads, Change Detection, Reconciliation, Error Handling, Dimensional Modeling, Query Tuning</w:t>
       </w:r>
     </w:p>
     <w:p>
       <w:pPr>
-        <w:spacing w:after="60"/>
+        <w:keepLines/>
+        <w:spacing w:before="80" w:after="80"/>
+        <w:shd w:fill="EEF3FA"/>
       </w:pPr>
       <w:r>
         <w:rPr>
+          <w:rFonts w:ascii="Aptos Display" w:hAnsi="Aptos Display"/>
           <w:b/>
+          <w:color w:val="1F4B99"/>
         </w:rPr>
-        <w:t>Data Platforms</w:t>
+        <w:t xml:space="preserve">Cloud Warehousing &amp; Distributed Processing: </w:t>
       </w:r>
       <w:r>
-        <w:t>{SQL Server, PostgreSQL, MySQL, Oracle, SASGRID, AWS, Azure}</w:t>
+        <w:rPr>
+          <w:rFonts w:ascii="Aptos Narrow" w:hAnsi="Aptos Narrow"/>
+        </w:rPr>
+        <w:t>Snowflake (Snowpipe, External Stages, Tasks, Streams, Warehouse &amp; Access Management), Databricks, PySpark, Delta Lake; working knowledge: Amazon Redshift, Google BigQuery</w:t>
       </w:r>
     </w:p>
     <w:p>
       <w:pPr>
-        <w:spacing w:after="60"/>
+        <w:keepLines/>
+        <w:spacing w:before="80" w:after="80"/>
+        <w:shd w:fill="FFFFFF"/>
       </w:pPr>
       <w:r>
         <w:rPr>
+          <w:rFonts w:ascii="Aptos Display" w:hAnsi="Aptos Display"/>
           <w:b/>
+          <w:color w:val="1F4B99"/>
         </w:rPr>
-        <w:t>Automation &amp; Integration</w:t>
+        <w:t xml:space="preserve">Databases &amp; Storage: </w:t>
       </w:r>
       <w:r>
-        <w:t>{ETL, API Integration, Workflow Automation, SaaS Integrations}</w:t>
+        <w:rPr>
+          <w:rFonts w:ascii="Aptos Narrow" w:hAnsi="Aptos Narrow"/>
+        </w:rPr>
+        <w:t>SAS Grid (SASGRID) Development &amp; Administration, SQLite, NoSQL (MongoDB); querying/connectivity: SQL Server, PostgreSQL, MySQL, Oracle; working knowledge: Elasticsearch; familiarity: Teradata, IBM DB2, Hadoop/Hive</w:t>
       </w:r>
     </w:p>
     <w:p>
       <w:pPr>
-        <w:spacing w:after="60"/>
+        <w:keepLines/>
+        <w:spacing w:before="80" w:after="80"/>
+        <w:shd w:fill="EEF3FA"/>
       </w:pPr>
       <w:r>
         <w:rPr>
+          <w:rFonts w:ascii="Aptos Display" w:hAnsi="Aptos Display"/>
           <w:b/>
+          <w:color w:val="1F4B99"/>
         </w:rPr>
-        <w:t>Tools</w:t>
+        <w:t xml:space="preserve">BI &amp; Semantic Modeling: </w:t>
       </w:r>
       <w:r>
-        <w:t>{GitHub, ServiceNow, Workday, MS O365, SSMS, DBeaver, VS Code, SAS EGP}</w:t>
+        <w:rPr>
+          <w:rFonts w:ascii="Aptos Narrow" w:hAnsi="Aptos Narrow"/>
+        </w:rPr>
+        <w:t>Power BI, DAX, Power Query (M), Star Schemas, Semantic Models, Dashboard Design, Row-Level Security, SSRS; Microsoft Access, SAP BusinessObjects (SAP BOBJ), SAP Analytics Cloud (SAC): Visualization Development, Report Subscriptions &amp; Data Delivery; Tableau: Project Delivery, Server Publishing &amp; Refresh, Light Administration</w:t>
       </w:r>
     </w:p>
     <w:p>
       <w:pPr>
+        <w:keepLines/>
+        <w:spacing w:before="80" w:after="80"/>
+        <w:shd w:fill="FFFFFF"/>
+      </w:pPr>
+      <w:r>
+        <w:rPr>
+          <w:rFonts w:ascii="Aptos Display" w:hAnsi="Aptos Display"/>
+          <w:b/>
+          <w:color w:val="1F4B99"/>
+        </w:rPr>
+        <w:t xml:space="preserve">Cloud Services: </w:t>
+      </w:r>
+      <w:r>
+        <w:rPr>
+          <w:rFonts w:ascii="Aptos Narrow" w:hAnsi="Aptos Narrow"/>
+        </w:rPr>
+        <w:t>AWS S3, Lambda, EC2, IAM, RDS Connectivity; Azure Storage, Azure Data Factory; project experience: Azure Synapse Pipelines &amp; Serverless SQL, Azure Functions; developing: Microsoft Fabric Lakehouse, Dataflows Gen2</w:t>
+      </w:r>
+    </w:p>
+    <w:p>
+      <w:pPr>
+        <w:keepLines/>
+        <w:spacing w:before="80" w:after="80"/>
+        <w:shd w:fill="EEF3FA"/>
+      </w:pPr>
+      <w:r>
+        <w:rPr>
+          <w:rFonts w:ascii="Aptos Display" w:hAnsi="Aptos Display"/>
+          <w:b/>
+          <w:color w:val="1F4B99"/>
+        </w:rPr>
+        <w:t xml:space="preserve">Orchestration &amp; Transformation: </w:t>
+      </w:r>
+      <w:r>
+        <w:rPr>
+          <w:rFonts w:ascii="Aptos Narrow" w:hAnsi="Aptos Narrow"/>
+        </w:rPr>
+        <w:t>SSIS, SQL Server Agent, cron, Scheduled Jobs, Logging &amp; Alerts; project experience: Apache Airflow, dbt (SQL/Jinja Models, Tests, Scheduling)</w:t>
+      </w:r>
+    </w:p>
+    <w:p>
+      <w:pPr>
+        <w:keepLines/>
+        <w:spacing w:before="80" w:after="80"/>
+        <w:shd w:fill="FFFFFF"/>
+      </w:pPr>
+      <w:r>
+        <w:rPr>
+          <w:rFonts w:ascii="Aptos Display" w:hAnsi="Aptos Display"/>
+          <w:b/>
+          <w:color w:val="1F4B99"/>
+        </w:rPr>
+        <w:t xml:space="preserve">Production Analytics: </w:t>
+      </w:r>
+      <w:r>
+        <w:rPr>
+          <w:rFonts w:ascii="Aptos Narrow" w:hAnsi="Aptos Narrow"/>
+        </w:rPr>
+        <w:t>Forecasting Pipelines, Rules-Based Models, Feature Engineering, Time-Based Holdouts, Baseline Comparisons, Leakage Prevention, Forecast Error &amp; Drift Monitoring</w:t>
+      </w:r>
+    </w:p>
+    <w:p>
+      <w:pPr>
+        <w:keepLines/>
+        <w:spacing w:before="80" w:after="80"/>
+        <w:shd w:fill="EEF3FA"/>
+      </w:pPr>
+      <w:r>
+        <w:rPr>
+          <w:rFonts w:ascii="Aptos Display" w:hAnsi="Aptos Display"/>
+          <w:b/>
+          <w:color w:val="1F4B99"/>
+        </w:rPr>
+        <w:t xml:space="preserve">Data Science Experiments &amp; Prototypes: </w:t>
+      </w:r>
+      <w:r>
+        <w:rPr>
+          <w:rFonts w:ascii="Aptos Narrow" w:hAnsi="Aptos Narrow"/>
+        </w:rPr>
+        <w:t>Statistical Inference, Bootstrapping, Regression, Classification, ARIMA/SARIMA, Clustering, A/B Testing, Cross-Validation, MAE/RMSE, Precision/Recall, ROC-AUC, Linear Programming</w:t>
+      </w:r>
+    </w:p>
+    <w:p>
+      <w:pPr>
+        <w:keepLines/>
+        <w:spacing w:before="80" w:after="80"/>
+        <w:shd w:fill="FFFFFF"/>
+      </w:pPr>
+      <w:r>
+        <w:rPr>
+          <w:rFonts w:ascii="Aptos Display" w:hAnsi="Aptos Display"/>
+          <w:b/>
+          <w:color w:val="1F4B99"/>
+        </w:rPr>
+        <w:t xml:space="preserve">Scientific Python: </w:t>
+      </w:r>
+      <w:r>
+        <w:rPr>
+          <w:rFonts w:ascii="Aptos Narrow" w:hAnsi="Aptos Narrow"/>
+        </w:rPr>
+        <w:t>pandas, NumPy, PyArrow; modeling/experiments: scikit-learn, statsmodels, XGBoost, LightGBM, PuLP</w:t>
+      </w:r>
+    </w:p>
+    <w:p>
+      <w:pPr>
+        <w:keepLines/>
+        <w:spacing w:before="80" w:after="80"/>
+        <w:shd w:fill="EEF3FA"/>
+      </w:pPr>
+      <w:r>
+        <w:rPr>
+          <w:rFonts w:ascii="Aptos Display" w:hAnsi="Aptos Display"/>
+          <w:b/>
+          <w:color w:val="1F4B99"/>
+        </w:rPr>
+        <w:t xml:space="preserve">Application &amp; Workflow Automation: </w:t>
+      </w:r>
+      <w:r>
+        <w:rPr>
+          <w:rFonts w:ascii="Aptos Narrow" w:hAnsi="Aptos Narrow"/>
+        </w:rPr>
+        <w:t>Streamlit, openpyxl, Pillow, ReportLab, cryptography, pywebview, pywin32, Excel &amp; Windows Automation</w:t>
+      </w:r>
+    </w:p>
+    <w:p>
+      <w:pPr>
+        <w:keepLines/>
+        <w:spacing w:before="80" w:after="80"/>
+        <w:shd w:fill="FFFFFF"/>
+      </w:pPr>
+      <w:r>
+        <w:rPr>
+          <w:rFonts w:ascii="Aptos Display" w:hAnsi="Aptos Display"/>
+          <w:b/>
+          <w:color w:val="1F4B99"/>
+        </w:rPr>
+        <w:t xml:space="preserve">Solution Architecture &amp; Governance: </w:t>
+      </w:r>
+      <w:r>
+        <w:rPr>
+          <w:rFonts w:ascii="Aptos Narrow" w:hAnsi="Aptos Narrow"/>
+        </w:rPr>
+        <w:t>Requirements Discovery, Integration Contracts, Data Architecture, Metric Definitions &amp; Lineage, RBAC, Least Privilege, Reliability &amp; Observability, Nonfunctional Requirements, Technology Selection, Design Review, Delivery Leadership</w:t>
+      </w:r>
+    </w:p>
+    <w:p>
+      <w:pPr>
+        <w:keepLines/>
+        <w:spacing w:before="80" w:after="80"/>
+        <w:shd w:fill="EEF3FA"/>
+      </w:pPr>
+      <w:r>
+        <w:rPr>
+          <w:rFonts w:ascii="Aptos Display" w:hAnsi="Aptos Display"/>
+          <w:b/>
+          <w:color w:val="1F4B99"/>
+        </w:rPr>
+        <w:t xml:space="preserve">Information Security Analytics: </w:t>
+      </w:r>
+      <w:r>
+        <w:rPr>
+          <w:rFonts w:ascii="Aptos Narrow" w:hAnsi="Aptos Narrow"/>
+        </w:rPr>
+        <w:t>Vulnerability Management, Identity &amp; Access Management (IAM), Data Loss Prevention (DLP), Phishing, Privileged Access Management (PAM), Cyber Threat Reporting; Security &amp; Operational Metrics, Data Behavior Analytics, Data Integration, Process Automation, Metric-Program Governance &amp; Stakeholder Leadership</w:t>
+      </w:r>
+    </w:p>
+    <w:p>
+      <w:pPr>
+        <w:keepLines/>
+        <w:spacing w:before="80" w:after="80"/>
+        <w:shd w:fill="FFFFFF"/>
+      </w:pPr>
+      <w:r>
+        <w:rPr>
+          <w:rFonts w:ascii="Aptos Display" w:hAnsi="Aptos Display"/>
+          <w:b/>
+          <w:color w:val="1F4B99"/>
+        </w:rPr>
+        <w:t xml:space="preserve">Operations &amp; Workforce Analytics: </w:t>
+      </w:r>
+      <w:r>
+        <w:rPr>
+          <w:rFonts w:ascii="Aptos Narrow" w:hAnsi="Aptos Narrow"/>
+        </w:rPr>
+        <w:t>Call/Contact Center Metric-Program Leadership, Service Levels, Average Handle Time (AHT), Abandonment, Occupancy, Utilization, Staffing &amp; Capacity Forecasting, Workforce/Shift Scheduling, Employee Attrition (Turnover)</w:t>
+      </w:r>
+    </w:p>
+    <w:p>
+      <w:pPr>
+        <w:keepLines/>
+        <w:spacing w:before="80" w:after="80"/>
+        <w:shd w:fill="EEF3FA"/>
+      </w:pPr>
+      <w:r>
+        <w:rPr>
+          <w:rFonts w:ascii="Aptos Display" w:hAnsi="Aptos Display"/>
+          <w:b/>
+          <w:color w:val="1F4B99"/>
+        </w:rPr>
+        <w:t xml:space="preserve">Enterprise Platforms &amp; Data Extraction: </w:t>
+      </w:r>
+      <w:r>
+        <w:rPr>
+          <w:rFonts w:ascii="Aptos Narrow" w:hAnsi="Aptos Narrow"/>
+        </w:rPr>
+        <w:t>Rocket Mobius (formerly ASG Mobius / ViewDirect): Navigation, REST API Extraction &amp; Parsing; Salesforce CRM: Navigation, API Integration &amp; Data Extraction; Okta &amp; Ping Identity: Usage Data Extraction &amp; Behavioral Analysis; Digital.ai Agility: Project Scheduling, Reporting, Productivity Communication &amp; Data Extraction</w:t>
+      </w:r>
+    </w:p>
+    <w:p>
+      <w:pPr>
+        <w:keepLines/>
+        <w:spacing w:before="80" w:after="80"/>
+        <w:shd w:fill="FFFFFF"/>
+      </w:pPr>
+      <w:r>
+        <w:rPr>
+          <w:rFonts w:ascii="Aptos Display" w:hAnsi="Aptos Display"/>
+          <w:b/>
+          <w:color w:val="1F4B99"/>
+        </w:rPr>
+        <w:t xml:space="preserve">Microsoft Productivity &amp; Collaboration: </w:t>
+      </w:r>
+      <w:r>
+        <w:rPr>
+          <w:rFonts w:ascii="Aptos Narrow" w:hAnsi="Aptos Narrow"/>
+        </w:rPr>
+        <w:t>Microsoft Office / Microsoft 365 (O365); Microsoft Excel: Formulas, PivotTables, Power Query, VBA, ODBC, Automation &amp; Proof-of-Concept Solutions; SharePoint / SharePoint Online: Repository Setup &amp; Management, Embedded Reporting, Knowledge-Base Governance, Power Apps, Workflow Automation &amp; Data Analysis</w:t>
+      </w:r>
+    </w:p>
+    <w:p>
+      <w:pPr>
+        <w:keepLines/>
+        <w:spacing w:before="80" w:after="80"/>
+        <w:shd w:fill="EEF3FA"/>
+      </w:pPr>
+      <w:r>
+        <w:rPr>
+          <w:rFonts w:ascii="Aptos Display" w:hAnsi="Aptos Display"/>
+          <w:b/>
+          <w:color w:val="1F4B99"/>
+        </w:rPr>
+        <w:t xml:space="preserve">Tools: </w:t>
+      </w:r>
+      <w:r>
+        <w:rPr>
+          <w:rFonts w:ascii="Aptos Narrow" w:hAnsi="Aptos Narrow"/>
+        </w:rPr>
+        <w:t>Git, GitHub, ServiceNow, Workday, Oracle SQL Developer (Querying &amp; Data Extraction), SSMS, DBeaver, VS Code, SAS Enterprise Guide</w:t>
+      </w:r>
+    </w:p>
+    <w:p>
+      <w:pPr>
+        <w:keepNext/>
         <w:spacing w:before="200" w:after="80"/>
       </w:pPr>
       <w:r>
@@ -219,10 +541,12 @@
     </w:p>
     <w:p>
       <w:pPr>
+        <w:keepNext/>
         <w:spacing w:before="160" w:after="20"/>
       </w:pPr>
       <w:r>
         <w:rPr>
+          <w:rFonts w:ascii="Aptos Display" w:hAnsi="Aptos Display"/>
           <w:b/>
           <w:sz w:val="21"/>
         </w:rPr>
@@ -231,11 +555,13 @@
     </w:p>
     <w:p>
       <w:pPr>
+        <w:keepNext/>
         <w:spacing w:after="60"/>
         <w:ind w:left="288"/>
       </w:pPr>
       <w:r>
         <w:rPr>
+          <w:rFonts w:ascii="Aptos Narrow" w:hAnsi="Aptos Narrow"/>
           <w:i/>
         </w:rPr>
         <w:t>Strategic Analytics: From Visibility to Action</w:t>
@@ -244,69 +570,155 @@
     <w:p>
       <w:pPr>
         <w:pStyle w:val="ListBullet"/>
+        <w:keepLines/>
         <w:spacing w:after="60"/>
         <w:ind w:left="576"/>
       </w:pPr>
       <w:r>
-        <w:t>Modernized enterprise reporting to accelerate risk decision-making</w:t>
+        <w:rPr>
+          <w:rFonts w:ascii="Aptos Narrow" w:hAnsi="Aptos Narrow"/>
+          <w:b/>
+        </w:rPr>
+        <w:t>Modernized enterprise reporting to accelerate risk decision-making:</w:t>
+      </w:r>
+      <w:r>
+        <w:t xml:space="preserve"> </w:t>
+      </w:r>
+      <w:r>
+        <w:rPr>
+          <w:rFonts w:ascii="Aptos Narrow" w:hAnsi="Aptos Narrow"/>
+        </w:rPr>
+        <w:t>Led enterprise metric and reporting transformation in a regulated financial environment—repositioning data from compliance checkbox to strategic asset. Enabled leadership to detect and respond to security trends faster, improving the organization's ability to manage regulatory and operational risk.</w:t>
       </w:r>
     </w:p>
     <w:p>
       <w:pPr>
         <w:pStyle w:val="ListBullet"/>
+        <w:keepLines/>
         <w:spacing w:after="60"/>
         <w:ind w:left="576"/>
       </w:pPr>
       <w:r>
-        <w:t>Unified reporting platform to drive stakeholder alignment</w:t>
+        <w:rPr>
+          <w:rFonts w:ascii="Aptos Narrow" w:hAnsi="Aptos Narrow"/>
+          <w:b/>
+        </w:rPr>
+        <w:t>Unified reporting platform to drive stakeholder alignment:</w:t>
+      </w:r>
+      <w:r>
+        <w:t xml:space="preserve"> </w:t>
+      </w:r>
+      <w:r>
+        <w:rPr>
+          <w:rFonts w:ascii="Aptos Narrow" w:hAnsi="Aptos Narrow"/>
+        </w:rPr>
+        <w:t>Executed Tableau-to-Power BI transformation, standardizing reporting patterns across operational and leadership audiences. Result: Single source of truth for security metrics reduced cross-functional friction and accelerated consensus on priority issues.</w:t>
       </w:r>
     </w:p>
     <w:p>
       <w:pPr>
         <w:pStyle w:val="ListBullet"/>
+        <w:keepLines/>
         <w:spacing w:after="60"/>
         <w:ind w:left="576"/>
       </w:pPr>
       <w:r>
-        <w:t>Translated complexity into clarity for decision-makers</w:t>
+        <w:rPr>
+          <w:rFonts w:ascii="Aptos Narrow" w:hAnsi="Aptos Narrow"/>
+          <w:b/>
+        </w:rPr>
+        <w:t>Translated complexity into clarity for decision-makers:</w:t>
+      </w:r>
+      <w:r>
+        <w:t xml:space="preserve"> </w:t>
+      </w:r>
+      <w:r>
+        <w:rPr>
+          <w:rFonts w:ascii="Aptos Narrow" w:hAnsi="Aptos Narrow"/>
+        </w:rPr>
+        <w:t>Designed executive-facing visualizations and KPI frameworks that distilled complex security data into clear, decision-ready narratives. Enabled non-technical leaders to grasp security posture and act with confidence.</w:t>
       </w:r>
     </w:p>
     <w:p>
       <w:pPr>
         <w:pStyle w:val="ListBullet"/>
+        <w:keepLines/>
         <w:spacing w:after="60"/>
         <w:ind w:left="576"/>
       </w:pPr>
       <w:r>
-        <w:t>Built trust through data quality</w:t>
+        <w:rPr>
+          <w:rFonts w:ascii="Aptos Narrow" w:hAnsi="Aptos Narrow"/>
+          <w:b/>
+        </w:rPr>
+        <w:t>Built trust through data quality:</w:t>
+      </w:r>
+      <w:r>
+        <w:t xml:space="preserve"> </w:t>
+      </w:r>
+      <w:r>
+        <w:rPr>
+          <w:rFonts w:ascii="Aptos Narrow" w:hAnsi="Aptos Narrow"/>
+        </w:rPr>
+        <w:t>Resolved cross-functional identity issues across AD, LDAP, and Entra ID infrastructure—eliminating data quality bottlenecks that undermined confidence in critical reporting. Improved metric reliability and reduced manual workarounds by teams.</w:t>
       </w:r>
     </w:p>
     <w:p>
       <w:pPr>
         <w:pStyle w:val="ListBullet"/>
+        <w:keepLines/>
         <w:spacing w:after="60"/>
         <w:ind w:left="576"/>
       </w:pPr>
       <w:r>
-        <w:t>Scaled efficiency through automation</w:t>
+        <w:rPr>
+          <w:rFonts w:ascii="Aptos Narrow" w:hAnsi="Aptos Narrow"/>
+          <w:b/>
+        </w:rPr>
+        <w:t>Scaled efficiency through automation:</w:t>
+      </w:r>
+      <w:r>
+        <w:t xml:space="preserve"> </w:t>
+      </w:r>
+      <w:r>
+        <w:rPr>
+          <w:rFonts w:ascii="Aptos Narrow" w:hAnsi="Aptos Narrow"/>
+        </w:rPr>
+        <w:t>Built automated validation and reconciliation workflows that eliminated routine manual remediation, freeing team bandwidth for strategic work and reducing error rates in metric delivery.</w:t>
       </w:r>
     </w:p>
     <w:p>
       <w:pPr>
         <w:pStyle w:val="ListBullet"/>
+        <w:keepLines/>
         <w:spacing w:after="60"/>
         <w:ind w:left="576"/>
       </w:pPr>
       <w:r>
-        <w:t>Extended impact through leadership</w:t>
+        <w:rPr>
+          <w:rFonts w:ascii="Aptos Narrow" w:hAnsi="Aptos Narrow"/>
+          <w:b/>
+        </w:rPr>
+        <w:t>Extended impact through leadership:</w:t>
+      </w:r>
+      <w:r>
+        <w:t xml:space="preserve"> </w:t>
+      </w:r>
+      <w:r>
+        <w:rPr>
+          <w:rFonts w:ascii="Aptos Narrow" w:hAnsi="Aptos Narrow"/>
+        </w:rPr>
+        <w:t>Mentored co-op and contractor resources in data engineering practices, scaling the team's capacity to deliver on critical programs while building organizational knowledge for long-term continuity.</w:t>
       </w:r>
     </w:p>
     <w:p>
       <w:pPr>
+        <w:keepNext/>
         <w:spacing w:before="160" w:after="20"/>
       </w:pPr>
       <w:r>
         <w:rPr>
+          <w:rFonts w:ascii="Aptos Display" w:hAnsi="Aptos Display"/>
           <w:b/>
           <w:sz w:val="21"/>
         </w:rPr>
@@ -315,11 +727,13 @@
     </w:p>
     <w:p>
       <w:pPr>
+        <w:keepNext/>
         <w:spacing w:after="60"/>
         <w:ind w:left="288"/>
       </w:pPr>
       <w:r>
         <w:rPr>
+          <w:rFonts w:ascii="Aptos Narrow" w:hAnsi="Aptos Narrow"/>
           <w:i/>
         </w:rPr>
         <w:t>Platform Modernization as Risk Mitigation</w:t>
@@ -328,59 +742,131 @@
     <w:p>
       <w:pPr>
         <w:pStyle w:val="ListBullet"/>
+        <w:keepLines/>
         <w:spacing w:after="60"/>
         <w:ind w:left="576"/>
       </w:pPr>
       <w:r>
-        <w:t>Eliminated operational risk through automation</w:t>
+        <w:rPr>
+          <w:rFonts w:ascii="Aptos Narrow" w:hAnsi="Aptos Narrow"/>
+          <w:b/>
+        </w:rPr>
+        <w:t>Eliminated operational risk through automation:</w:t>
+      </w:r>
+      <w:r>
+        <w:t xml:space="preserve"> </w:t>
+      </w:r>
+      <w:r>
+        <w:rPr>
+          <w:rFonts w:ascii="Aptos Narrow" w:hAnsi="Aptos Narrow"/>
+        </w:rPr>
+        <w:t>Architected and automated SAS-based warehouse and reporting workflows using REST APIs and PowerShell orchestration. Eliminated manual processing bottlenecks—reducing human error in compliance reporting and freeing security operations to focus on investigative work.</w:t>
       </w:r>
     </w:p>
     <w:p>
       <w:pPr>
         <w:pStyle w:val="ListBullet"/>
+        <w:keepLines/>
         <w:spacing w:after="60"/>
         <w:ind w:left="576"/>
       </w:pPr>
       <w:r>
-        <w:t>Strengthened governance decisions with reliable analytics</w:t>
+        <w:rPr>
+          <w:rFonts w:ascii="Aptos Narrow" w:hAnsi="Aptos Narrow"/>
+          <w:b/>
+        </w:rPr>
+        <w:t>Strengthened governance decisions with reliable analytics:</w:t>
+      </w:r>
+      <w:r>
+        <w:t xml:space="preserve"> </w:t>
+      </w:r>
+      <w:r>
+        <w:rPr>
+          <w:rFonts w:ascii="Aptos Narrow" w:hAnsi="Aptos Narrow"/>
+        </w:rPr>
+        <w:t>Delivered compliance, audit, and risk analytics that enabled leadership and governance teams to make decisions backed by dependable data. Positioned compliance reporting as a strategic lever for enterprise risk management.</w:t>
       </w:r>
     </w:p>
     <w:p>
       <w:pPr>
         <w:pStyle w:val="ListBullet"/>
+        <w:keepLines/>
         <w:spacing w:after="60"/>
         <w:ind w:left="576"/>
       </w:pPr>
       <w:r>
-        <w:t>Made complexity accessible to non-technical decision-makers</w:t>
+        <w:rPr>
+          <w:rFonts w:ascii="Aptos Narrow" w:hAnsi="Aptos Narrow"/>
+          <w:b/>
+        </w:rPr>
+        <w:t>Made complexity accessible to non-technical decision-makers:</w:t>
+      </w:r>
+      <w:r>
+        <w:t xml:space="preserve"> </w:t>
+      </w:r>
+      <w:r>
+        <w:rPr>
+          <w:rFonts w:ascii="Aptos Narrow" w:hAnsi="Aptos Narrow"/>
+        </w:rPr>
+        <w:t>Translated dense compliance datasets into clear reporting structures and visual narratives that enabled executives and stakeholders to understand risk posture without technical training.</w:t>
       </w:r>
     </w:p>
     <w:p>
       <w:pPr>
         <w:pStyle w:val="ListBullet"/>
+        <w:keepLines/>
         <w:spacing w:after="60"/>
         <w:ind w:left="576"/>
       </w:pPr>
       <w:r>
-        <w:t>Built for scale and sustainability</w:t>
+        <w:rPr>
+          <w:rFonts w:ascii="Aptos Narrow" w:hAnsi="Aptos Narrow"/>
+          <w:b/>
+        </w:rPr>
+        <w:t>Built for scale and sustainability:</w:t>
+      </w:r>
+      <w:r>
+        <w:t xml:space="preserve"> </w:t>
+      </w:r>
+      <w:r>
+        <w:rPr>
+          <w:rFonts w:ascii="Aptos Narrow" w:hAnsi="Aptos Narrow"/>
+        </w:rPr>
+        <w:t>Led platform modernization and environment hardening that not only improved scalability but reduced the maintenance burden on teams—allowing future focus on innovation rather than technical debt.</w:t>
       </w:r>
     </w:p>
     <w:p>
       <w:pPr>
         <w:pStyle w:val="ListBullet"/>
+        <w:keepLines/>
         <w:spacing w:after="60"/>
         <w:ind w:left="576"/>
       </w:pPr>
       <w:r>
-        <w:t>Built team capability for sustained delivery</w:t>
+        <w:rPr>
+          <w:rFonts w:ascii="Aptos Narrow" w:hAnsi="Aptos Narrow"/>
+          <w:b/>
+        </w:rPr>
+        <w:t>Built team capability for sustained delivery:</w:t>
+      </w:r>
+      <w:r>
+        <w:t xml:space="preserve"> </w:t>
+      </w:r>
+      <w:r>
+        <w:rPr>
+          <w:rFonts w:ascii="Aptos Narrow" w:hAnsi="Aptos Narrow"/>
+        </w:rPr>
+        <w:t>Established delivery practices and mentoring frameworks that improved how the team worked together. Result: Higher execution quality, better supportability, and reduced dependency on individual contributors.</w:t>
       </w:r>
     </w:p>
     <w:p>
       <w:pPr>
+        <w:keepNext/>
         <w:spacing w:before="160" w:after="20"/>
       </w:pPr>
       <w:r>
         <w:rPr>
+          <w:rFonts w:ascii="Aptos Display" w:hAnsi="Aptos Display"/>
           <w:b/>
           <w:sz w:val="21"/>
         </w:rPr>
@@ -389,11 +875,13 @@
     </w:p>
     <w:p>
       <w:pPr>
+        <w:keepNext/>
         <w:spacing w:after="60"/>
         <w:ind w:left="288"/>
       </w:pPr>
       <w:r>
         <w:rPr>
+          <w:rFonts w:ascii="Aptos Narrow" w:hAnsi="Aptos Narrow"/>
           <w:i/>
         </w:rPr>
         <w:t>Foundation for Trusted Security Analytics</w:t>
@@ -402,39 +890,83 @@
     <w:p>
       <w:pPr>
         <w:pStyle w:val="ListBullet"/>
+        <w:keepLines/>
         <w:spacing w:after="60"/>
         <w:ind w:left="576"/>
       </w:pPr>
       <w:r>
-        <w:t>Redesigned metrics program for business alignment</w:t>
+        <w:rPr>
+          <w:rFonts w:ascii="Aptos Narrow" w:hAnsi="Aptos Narrow"/>
+          <w:b/>
+        </w:rPr>
+        <w:t>Redesigned metrics program for business alignment:</w:t>
+      </w:r>
+      <w:r>
+        <w:t xml:space="preserve"> </w:t>
+      </w:r>
+      <w:r>
+        <w:rPr>
+          <w:rFonts w:ascii="Aptos Narrow" w:hAnsi="Aptos Narrow"/>
+        </w:rPr>
+        <w:t>Expanded and rebuilt the information security metric program from the ground up—shifting from ad hoc reporting to repeatable, reliable processes that enabled leadership and operational teams to drive decisions consistently.</w:t>
       </w:r>
     </w:p>
     <w:p>
       <w:pPr>
         <w:pStyle w:val="ListBullet"/>
+        <w:keepLines/>
         <w:spacing w:after="60"/>
         <w:ind w:left="576"/>
       </w:pPr>
       <w:r>
-        <w:t>Scaled metrics without scaling manual effort</w:t>
+        <w:rPr>
+          <w:rFonts w:ascii="Aptos Narrow" w:hAnsi="Aptos Narrow"/>
+          <w:b/>
+        </w:rPr>
+        <w:t>Scaled metrics without scaling manual effort:</w:t>
+      </w:r>
+      <w:r>
+        <w:t xml:space="preserve"> </w:t>
+      </w:r>
+      <w:r>
+        <w:rPr>
+          <w:rFonts w:ascii="Aptos Narrow" w:hAnsi="Aptos Narrow"/>
+        </w:rPr>
+        <w:t>Transformed fragmented Excel workflows into a unified data pipeline using directory-based ingestion, NAS storage, and SAS Grid processing. Eliminated manual reconciliation overhead and created foundation for enterprise-scale reporting.</w:t>
       </w:r>
     </w:p>
     <w:p>
       <w:pPr>
         <w:pStyle w:val="ListBullet"/>
+        <w:keepLines/>
         <w:spacing w:after="60"/>
         <w:ind w:left="576"/>
       </w:pPr>
       <w:r>
-        <w:t>Connected technical metrics to business narratives</w:t>
+        <w:rPr>
+          <w:rFonts w:ascii="Aptos Narrow" w:hAnsi="Aptos Narrow"/>
+          <w:b/>
+        </w:rPr>
+        <w:t>Connected technical metrics to business narratives:</w:t>
+      </w:r>
+      <w:r>
+        <w:t xml:space="preserve"> </w:t>
+      </w:r>
+      <w:r>
+        <w:rPr>
+          <w:rFonts w:ascii="Aptos Narrow" w:hAnsi="Aptos Narrow"/>
+        </w:rPr>
+        <w:t>Built reporting and visualization structures that translated raw technical metrics into clear decision narratives—helping security and risk teams communicate priorities and progress to executives in business terms.</w:t>
       </w:r>
     </w:p>
     <w:p>
       <w:pPr>
+        <w:keepNext/>
         <w:spacing w:before="160" w:after="20"/>
       </w:pPr>
       <w:r>
         <w:rPr>
+          <w:rFonts w:ascii="Aptos Display" w:hAnsi="Aptos Display"/>
           <w:b/>
           <w:sz w:val="21"/>
         </w:rPr>
@@ -443,11 +975,13 @@
     </w:p>
     <w:p>
       <w:pPr>
+        <w:keepNext/>
         <w:spacing w:after="60"/>
         <w:ind w:left="288"/>
       </w:pPr>
       <w:r>
         <w:rPr>
+          <w:rFonts w:ascii="Aptos Narrow" w:hAnsi="Aptos Narrow"/>
           <w:i/>
         </w:rPr>
         <w:t>Analytics-Driven Operational Excellence</w:t>
@@ -456,59 +990,131 @@
     <w:p>
       <w:pPr>
         <w:pStyle w:val="ListBullet"/>
+        <w:keepLines/>
         <w:spacing w:after="60"/>
         <w:ind w:left="576"/>
       </w:pPr>
       <w:r>
-        <w:t>Transformed operations through data-driven leadership</w:t>
+        <w:rPr>
+          <w:rFonts w:ascii="Aptos Narrow" w:hAnsi="Aptos Narrow"/>
+          <w:b/>
+        </w:rPr>
+        <w:t>Transformed operations through data-driven leadership:</w:t>
+      </w:r>
+      <w:r>
+        <w:t xml:space="preserve"> </w:t>
+      </w:r>
+      <w:r>
+        <w:rPr>
+          <w:rFonts w:ascii="Aptos Narrow" w:hAnsi="Aptos Narrow"/>
+        </w:rPr>
+        <w:t>Led reporting and analytics for customer operations, translating operational metrics into actionable guidance that helped leadership optimize staffing, improve quality, and drive down costs.</w:t>
       </w:r>
     </w:p>
     <w:p>
       <w:pPr>
         <w:pStyle w:val="ListBullet"/>
+        <w:keepLines/>
         <w:spacing w:after="60"/>
         <w:ind w:left="576"/>
       </w:pPr>
       <w:r>
-        <w:t>Built shared visibility across the organization</w:t>
+        <w:rPr>
+          <w:rFonts w:ascii="Aptos Narrow" w:hAnsi="Aptos Narrow"/>
+          <w:b/>
+        </w:rPr>
+        <w:t>Built shared visibility across the organization:</w:t>
+      </w:r>
+      <w:r>
+        <w:t xml:space="preserve"> </w:t>
+      </w:r>
+      <w:r>
+        <w:rPr>
+          <w:rFonts w:ascii="Aptos Narrow" w:hAnsi="Aptos Narrow"/>
+        </w:rPr>
+        <w:t>Designed and supported an internal analytics platform that unified operational efficiency, service quality, and customer experience metrics. Enabled frontline supervisors and executives to see the same data story and align on priorities.</w:t>
       </w:r>
     </w:p>
     <w:p>
       <w:pPr>
         <w:pStyle w:val="ListBullet"/>
+        <w:keepLines/>
         <w:spacing w:after="60"/>
         <w:ind w:left="576"/>
       </w:pPr>
       <w:r>
-        <w:t>Made performance tangible across all levels</w:t>
+        <w:rPr>
+          <w:rFonts w:ascii="Aptos Narrow" w:hAnsi="Aptos Narrow"/>
+          <w:b/>
+        </w:rPr>
+        <w:t>Made performance tangible across all levels:</w:t>
+      </w:r>
+      <w:r>
+        <w:t xml:space="preserve"> </w:t>
+      </w:r>
+      <w:r>
+        <w:rPr>
+          <w:rFonts w:ascii="Aptos Narrow" w:hAnsi="Aptos Narrow"/>
+        </w:rPr>
+        <w:t>Created dashboards and visual performance views that told operational stories differently for frontline teams and executives—helping each audience understand their role in organizational success.</w:t>
       </w:r>
     </w:p>
     <w:p>
       <w:pPr>
         <w:pStyle w:val="ListBullet"/>
+        <w:keepLines/>
         <w:spacing w:after="60"/>
         <w:ind w:left="576"/>
       </w:pPr>
       <w:r>
-        <w:t>Leveraged technology for competitive advantage</w:t>
+        <w:rPr>
+          <w:rFonts w:ascii="Aptos Narrow" w:hAnsi="Aptos Narrow"/>
+          <w:b/>
+        </w:rPr>
+        <w:t>Leveraged technology for competitive advantage:</w:t>
+      </w:r>
+      <w:r>
+        <w:t xml:space="preserve"> </w:t>
+      </w:r>
+      <w:r>
+        <w:rPr>
+          <w:rFonts w:ascii="Aptos Narrow" w:hAnsi="Aptos Narrow"/>
+        </w:rPr>
+        <w:t>Partnered across IT, vendors, and business leadership to implement speech analytics and identity verification solutions—giving operations new insights into customer interactions, enabling faster issue identification and improving customer experience outcomes.</w:t>
       </w:r>
     </w:p>
     <w:p>
       <w:pPr>
         <w:pStyle w:val="ListBullet"/>
+        <w:keepLines/>
         <w:spacing w:after="60"/>
         <w:ind w:left="576"/>
       </w:pPr>
       <w:r>
-        <w:t>Built high-performing team culture</w:t>
+        <w:rPr>
+          <w:rFonts w:ascii="Aptos Narrow" w:hAnsi="Aptos Narrow"/>
+          <w:b/>
+        </w:rPr>
+        <w:t>Built high-performing team culture:</w:t>
+      </w:r>
+      <w:r>
+        <w:t xml:space="preserve"> </w:t>
+      </w:r>
+      <w:r>
+        <w:rPr>
+          <w:rFonts w:ascii="Aptos Narrow" w:hAnsi="Aptos Narrow"/>
+        </w:rPr>
+        <w:t>Managed direct reports and orchestrated cross-functional execution, creating an environment where analytical thinking became embedded in operational decision-making.</w:t>
       </w:r>
     </w:p>
     <w:p>
       <w:pPr>
+        <w:keepNext/>
         <w:spacing w:before="160" w:after="20"/>
       </w:pPr>
       <w:r>
         <w:rPr>
+          <w:rFonts w:ascii="Aptos Display" w:hAnsi="Aptos Display"/>
           <w:b/>
           <w:sz w:val="21"/>
         </w:rPr>
@@ -517,11 +1123,13 @@
     </w:p>
     <w:p>
       <w:pPr>
+        <w:keepNext/>
         <w:spacing w:after="60"/>
         <w:ind w:left="288"/>
       </w:pPr>
       <w:r>
         <w:rPr>
+          <w:rFonts w:ascii="Aptos Narrow" w:hAnsi="Aptos Narrow"/>
           <w:i/>
         </w:rPr>
         <w:t>Systems Integration &amp; Application Support</w:t>
@@ -530,29 +1138,39 @@
     <w:p>
       <w:pPr>
         <w:pStyle w:val="ListBullet"/>
+        <w:keepLines/>
         <w:spacing w:after="60"/>
         <w:ind w:left="576"/>
       </w:pPr>
       <w:r>
+        <w:rPr>
+          <w:rFonts w:ascii="Aptos Narrow" w:hAnsi="Aptos Narrow"/>
+        </w:rPr>
         <w:t>Supported legacy application migration and modernization efforts, improving compatibility and operational stability.</w:t>
       </w:r>
     </w:p>
     <w:p>
       <w:pPr>
         <w:pStyle w:val="ListBullet"/>
+        <w:keepLines/>
         <w:spacing w:after="60"/>
         <w:ind w:left="576"/>
       </w:pPr>
       <w:r>
+        <w:rPr>
+          <w:rFonts w:ascii="Aptos Narrow" w:hAnsi="Aptos Narrow"/>
+        </w:rPr>
         <w:t>Partnered with business and technical stakeholders to validate requirements, update scripts, and streamline application support processes.</w:t>
       </w:r>
     </w:p>
     <w:p>
       <w:pPr>
+        <w:keepNext/>
         <w:spacing w:before="160" w:after="20"/>
       </w:pPr>
       <w:r>
         <w:rPr>
+          <w:rFonts w:ascii="Aptos Display" w:hAnsi="Aptos Display"/>
           <w:b/>
           <w:sz w:val="21"/>
         </w:rPr>
@@ -561,11 +1179,13 @@
     </w:p>
     <w:p>
       <w:pPr>
+        <w:keepNext/>
         <w:spacing w:after="60"/>
         <w:ind w:left="288"/>
       </w:pPr>
       <w:r>
         <w:rPr>
+          <w:rFonts w:ascii="Aptos Narrow" w:hAnsi="Aptos Narrow"/>
           <w:i/>
         </w:rPr>
         <w:t>Democratizing Data for Faster Decisions</w:t>
@@ -574,49 +1194,107 @@
     <w:p>
       <w:pPr>
         <w:pStyle w:val="ListBullet"/>
+        <w:keepLines/>
         <w:spacing w:after="60"/>
         <w:ind w:left="576"/>
       </w:pPr>
       <w:r>
-        <w:t>Centralized operational visibility through reporting modernization</w:t>
+        <w:rPr>
+          <w:rFonts w:ascii="Aptos Narrow" w:hAnsi="Aptos Narrow"/>
+          <w:b/>
+        </w:rPr>
+        <w:t>Centralized operational visibility through reporting modernization:</w:t>
+      </w:r>
+      <w:r>
+        <w:t xml:space="preserve"> </w:t>
+      </w:r>
+      <w:r>
+        <w:rPr>
+          <w:rFonts w:ascii="Aptos Narrow" w:hAnsi="Aptos Narrow"/>
+        </w:rPr>
+        <w:t>Created and maintained BI and operational reporting solutions (SSIS/SSRS) that unified customer service, workforce, and performance metrics. Eliminated the need for multiple reporting systems and reduced confusion about "single source of truth."</w:t>
       </w:r>
     </w:p>
     <w:p>
       <w:pPr>
         <w:pStyle w:val="ListBullet"/>
+        <w:keepLines/>
         <w:spacing w:after="60"/>
         <w:ind w:left="576"/>
       </w:pPr>
       <w:r>
-        <w:t>Enabled faster decisions at all levels</w:t>
+        <w:rPr>
+          <w:rFonts w:ascii="Aptos Narrow" w:hAnsi="Aptos Narrow"/>
+          <w:b/>
+        </w:rPr>
+        <w:t>Enabled faster decisions at all levels:</w:t>
+      </w:r>
+      <w:r>
+        <w:t xml:space="preserve"> </w:t>
+      </w:r>
+      <w:r>
+        <w:rPr>
+          <w:rFonts w:ascii="Aptos Narrow" w:hAnsi="Aptos Narrow"/>
+        </w:rPr>
+        <w:t>Developed self-service reporting capabilities that gave team members and leaders direct access to scorecards, trend analysis, and workforce metrics—reducing time between question and answer, enabling faster decision velocity.</w:t>
       </w:r>
     </w:p>
     <w:p>
       <w:pPr>
         <w:pStyle w:val="ListBullet"/>
+        <w:keepLines/>
         <w:spacing w:after="60"/>
         <w:ind w:left="576"/>
       </w:pPr>
       <w:r>
-        <w:t>Built real-time operational awareness</w:t>
+        <w:rPr>
+          <w:rFonts w:ascii="Aptos Narrow" w:hAnsi="Aptos Narrow"/>
+          <w:b/>
+        </w:rPr>
+        <w:t>Built real-time operational awareness:</w:t>
+      </w:r>
+      <w:r>
+        <w:t xml:space="preserve"> </w:t>
+      </w:r>
+      <w:r>
+        <w:rPr>
+          <w:rFonts w:ascii="Aptos Narrow" w:hAnsi="Aptos Narrow"/>
+        </w:rPr>
+        <w:t>Designed operational dashboards and visual analyses that revealed performance patterns in real-time, helping leaders spot emerging issues and respond proactively rather than reactively.</w:t>
       </w:r>
     </w:p>
     <w:p>
       <w:pPr>
         <w:pStyle w:val="ListBullet"/>
+        <w:keepLines/>
         <w:spacing w:after="60"/>
         <w:ind w:left="576"/>
       </w:pPr>
       <w:r>
-        <w:t>Turned anomalies into action</w:t>
+        <w:rPr>
+          <w:rFonts w:ascii="Aptos Narrow" w:hAnsi="Aptos Narrow"/>
+          <w:b/>
+        </w:rPr>
+        <w:t>Turned anomalies into action:</w:t>
+      </w:r>
+      <w:r>
+        <w:t xml:space="preserve"> </w:t>
+      </w:r>
+      <w:r>
+        <w:rPr>
+          <w:rFonts w:ascii="Aptos Narrow" w:hAnsi="Aptos Narrow"/>
+        </w:rPr>
+        <w:t>Applied data mining techniques to detect anomalies and outliers in operational data—enabling teams to identify and fix issues before they cascaded into performance problems.</w:t>
       </w:r>
     </w:p>
     <w:p>
       <w:pPr>
+        <w:keepNext/>
         <w:spacing w:before="160" w:after="20"/>
       </w:pPr>
       <w:r>
         <w:rPr>
+          <w:rFonts w:ascii="Aptos Display" w:hAnsi="Aptos Display"/>
           <w:b/>
           <w:sz w:val="21"/>
         </w:rPr>
@@ -625,11 +1303,13 @@
     </w:p>
     <w:p>
       <w:pPr>
+        <w:keepNext/>
         <w:spacing w:after="60"/>
         <w:ind w:left="288"/>
       </w:pPr>
       <w:r>
         <w:rPr>
+          <w:rFonts w:ascii="Aptos Narrow" w:hAnsi="Aptos Narrow"/>
           <w:i/>
         </w:rPr>
         <w:t>Building Operational Intelligence from Ground Up</w:t>
@@ -638,35 +1318,78 @@
     <w:p>
       <w:pPr>
         <w:pStyle w:val="ListBullet"/>
+        <w:keepLines/>
         <w:spacing w:after="60"/>
         <w:ind w:left="576"/>
       </w:pPr>
       <w:r>
-        <w:t>Aligned incentives with business priorities through analytics</w:t>
+        <w:rPr>
+          <w:rFonts w:ascii="Aptos Narrow" w:hAnsi="Aptos Narrow"/>
+          <w:b/>
+        </w:rPr>
+        <w:t>Aligned incentives with business priorities through analytics:</w:t>
+      </w:r>
+      <w:r>
+        <w:t xml:space="preserve"> </w:t>
+      </w:r>
+      <w:r>
+        <w:rPr>
+          <w:rFonts w:ascii="Aptos Narrow" w:hAnsi="Aptos Narrow"/>
+        </w:rPr>
+        <w:t>Built scorecard and incentive reporting solutions that connected pay to performance metrics and business drivers—making it clear to teams how their work contributed to organizational goals.</w:t>
       </w:r>
     </w:p>
     <w:p>
       <w:pPr>
         <w:pStyle w:val="ListBullet"/>
+        <w:keepLines/>
         <w:spacing w:after="60"/>
         <w:ind w:left="576"/>
       </w:pPr>
       <w:r>
-        <w:t>Reduced operational overhead through automation</w:t>
+        <w:rPr>
+          <w:rFonts w:ascii="Aptos Narrow" w:hAnsi="Aptos Narrow"/>
+          <w:b/>
+        </w:rPr>
+        <w:t>Reduced operational overhead through automation:</w:t>
+      </w:r>
+      <w:r>
+        <w:t xml:space="preserve"> </w:t>
+      </w:r>
+      <w:r>
+        <w:rPr>
+          <w:rFonts w:ascii="Aptos Narrow" w:hAnsi="Aptos Narrow"/>
+        </w:rPr>
+        <w:t>Automated payroll and operational reporting workflows, eliminating routine manual processing. Freed finance and operations teams to focus on analysis and decision-making rather than data movement.</w:t>
       </w:r>
     </w:p>
     <w:p>
       <w:pPr>
         <w:pStyle w:val="ListBullet"/>
+        <w:keepLines/>
         <w:spacing w:after="60"/>
         <w:ind w:left="576"/>
       </w:pPr>
       <w:r>
-        <w:t>Delivered repeatability as competitive advantage</w:t>
+        <w:rPr>
+          <w:rFonts w:ascii="Aptos Narrow" w:hAnsi="Aptos Narrow"/>
+          <w:b/>
+        </w:rPr>
+        <w:t>Delivered repeatability as competitive advantage:</w:t>
+      </w:r>
+      <w:r>
+        <w:t xml:space="preserve"> </w:t>
+      </w:r>
+      <w:r>
+        <w:rPr>
+          <w:rFonts w:ascii="Aptos Narrow" w:hAnsi="Aptos Narrow"/>
+        </w:rPr>
+        <w:t>Translated business requirements into repeatable reporting products that reliably supported operational and leadership decisions—reducing the cost per decision and enabling consistency at scale.</w:t>
       </w:r>
     </w:p>
     <w:p>
       <w:pPr>
+        <w:keepNext/>
         <w:spacing w:before="200" w:after="80"/>
       </w:pPr>
       <w:r>
@@ -684,6 +1407,9 @@
         <w:spacing w:after="20"/>
       </w:pPr>
       <w:r>
+        <w:rPr>
+          <w:rFonts w:ascii="Aptos Narrow" w:hAnsi="Aptos Narrow"/>
+        </w:rPr>
         <w:t>University of Cincinnati — Coursework in Cultural Anthropology, 2007–2009</w:t>
       </w:r>
     </w:p>
@@ -693,6 +1419,9 @@
         <w:spacing w:after="20"/>
       </w:pPr>
       <w:r>
+        <w:rPr>
+          <w:rFonts w:ascii="Aptos Narrow" w:hAnsi="Aptos Narrow"/>
+        </w:rPr>
         <w:t>Cincinnati State — Coursework in Computer Networking, 2010–2011</w:t>
       </w:r>
     </w:p>
@@ -702,11 +1431,15 @@
         <w:spacing w:after="20"/>
       </w:pPr>
       <w:r>
+        <w:rPr>
+          <w:rFonts w:ascii="Aptos Narrow" w:hAnsi="Aptos Narrow"/>
+        </w:rPr>
         <w:t>Fifth Third Bank — Information Security Leadership Program, 2022–2023</w:t>
       </w:r>
     </w:p>
     <w:p>
       <w:pPr>
+        <w:keepNext/>
         <w:spacing w:before="200" w:after="80"/>
       </w:pPr>
       <w:r>
@@ -724,6 +1457,9 @@
         <w:spacing w:after="20"/>
       </w:pPr>
       <w:r>
+        <w:rPr>
+          <w:rFonts w:ascii="Aptos Narrow" w:hAnsi="Aptos Narrow"/>
+        </w:rPr>
         <w:t>Horizon Award — Fifth Third Bank (2022)</w:t>
       </w:r>
     </w:p>
@@ -733,29 +1469,10 @@
         <w:spacing w:after="20"/>
       </w:pPr>
       <w:r>
+        <w:rPr>
+          <w:rFonts w:ascii="Aptos Narrow" w:hAnsi="Aptos Narrow"/>
+        </w:rPr>
         <w:t>Spirit of the Pin — Fifth Third Bank (multiple years)</w:t>
-      </w:r>
-    </w:p>
-    <w:p/>
-    <w:p>
-      <w:pPr>
-        <w:spacing w:before="200" w:after="80"/>
-      </w:pPr>
-      <w:r>
-        <w:rPr>
-          <w:b/>
-          <w:color w:val="1F4B99"/>
-          <w:sz w:val="24"/>
-        </w:rPr>
-        <w:t>CORE KEYWORDS</w:t>
-      </w:r>
-    </w:p>
-    <w:p>
-      <w:pPr>
-        <w:spacing w:after="40"/>
-      </w:pPr>
-      <w:r>
-        <w:t>Keywords: Data Engineering, Data Architecture, Analytics Leadership, Business Intelligence, ETL, API Integration, Data Governance, Data Quality, Workflow Automation, Reporting Modernization, KPI Design, Executive Reporting, Stakeholder Alignment, Cross-Functional Leadership, Risk &amp; Compliance, SQL, Python, SAS, PowerShell, DAX, Tableau, Power BI, SSIS, SSRS, SQL Server, PostgreSQL, MySQL, Oracle, AWS, Azure, ServiceNow, Workday, GitHub</w:t>
       </w:r>
     </w:p>
     <w:sectPr>
@@ -1131,6 +1848,9 @@
     <w:name w:val="Normal"/>
     <w:qFormat/>
     <w:rsid w:val="00FC693F"/>
+    <w:rPr>
+      <w:sz w:val="20"/>
+    </w:rPr>
   </w:style>
   <w:style w:type="paragraph" w:styleId="Header">
     <w:name w:val="header"/>

</xml_diff>